<commit_message>
Fix: Replace Equifax ATS resume with correct edited CV (career-ops). Clean PDF without file path leaks.
</commit_message>
<xml_diff>
--- a/Achu_Pradeep_Resume.docx
+++ b/Achu_Pradeep_Resume.docx
@@ -2,1247 +2,776 @@
 <file path=word/document.xml><?xml version="1.0" encoding="utf-8"?>
 <w:document xmlns:wpc="http://schemas.microsoft.com/office/word/2010/wordprocessingCanvas" xmlns:mo="http://schemas.microsoft.com/office/mac/office/2008/main" xmlns:mc="http://schemas.openxmlformats.org/markup-compatibility/2006" xmlns:mv="urn:schemas-microsoft-com:mac:vml" xmlns:o="urn:schemas-microsoft-com:office:office" xmlns:r="http://schemas.openxmlformats.org/officeDocument/2006/relationships" xmlns:m="http://schemas.openxmlformats.org/officeDocument/2006/math" xmlns:v="urn:schemas-microsoft-com:vml" xmlns:wp14="http://schemas.microsoft.com/office/word/2010/wordprocessingDrawing" xmlns:wp="http://schemas.openxmlformats.org/drawingml/2006/wordprocessingDrawing" xmlns:w10="urn:schemas-microsoft-com:office:word" xmlns:w="http://schemas.openxmlformats.org/wordprocessingml/2006/main" xmlns:w14="http://schemas.microsoft.com/office/word/2010/wordml" xmlns:wpg="http://schemas.microsoft.com/office/word/2010/wordprocessingGroup" xmlns:wpi="http://schemas.microsoft.com/office/word/2010/wordprocessingInk" xmlns:wne="http://schemas.microsoft.com/office/word/2006/wordml" xmlns:wps="http://schemas.microsoft.com/office/word/2010/wordprocessingShape" mc:Ignorable="w14 wp14">
   <w:body>
-    <w:tbl>
-      <w:tblPr>
-        <w:tblStyle w:val="TableGrid"/>
-        <w:tblW w:type="auto" w:w="0"/>
-        <w:tblLook w:firstColumn="1" w:firstRow="1" w:lastColumn="0" w:lastRow="0" w:noHBand="0" w:noVBand="1" w:val="04A0"/>
-      </w:tblPr>
-      <w:tblGrid>
-        <w:gridCol w:w="9972"/>
-      </w:tblGrid>
-      <w:tr>
-        <w:tc>
-          <w:tcPr>
-            <w:tcW w:type="dxa" w:w="9360"/>
-            <w:shd w:val="clear" w:color="auto" w:fill="0D1B2A"/>
-          </w:tcPr>
-          <w:p>
-            <w:pPr>
-              <w:spacing w:before="240" w:after="40"/>
-              <w:jc w:val="center"/>
-            </w:pPr>
-            <w:r>
-              <w:rPr>
-                <w:b/>
-                <w:color w:val="FFFFFF"/>
-                <w:sz w:val="44"/>
-              </w:rPr>
-              <w:t>ACHU PRADEEP</w:t>
-            </w:r>
-          </w:p>
-          <w:p>
-            <w:pPr>
-              <w:spacing w:before="0" w:after="120"/>
-              <w:jc w:val="center"/>
-            </w:pPr>
-            <w:r>
-              <w:rPr>
-                <w:color w:val="60A5FA"/>
-                <w:sz w:val="22"/>
-              </w:rPr>
-              <w:t>Site Reliability Engineer  |  DevOps Engineer  |  AI Agent Developer</w:t>
-            </w:r>
-          </w:p>
-          <w:p>
-            <w:pPr>
-              <w:spacing w:before="0" w:after="200"/>
-              <w:jc w:val="center"/>
-            </w:pPr>
-            <w:r>
-              <w:rPr>
-                <w:color w:val="94A3B8"/>
-                <w:sz w:val="18"/>
-              </w:rPr>
-              <w:t>achupradeep3050@gmail.com  |  linkedin.com/in/achu-pradeep-702667404  |  github.com/achupradeep3050</w:t>
-            </w:r>
-          </w:p>
-        </w:tc>
-      </w:tr>
-    </w:tbl>
-    <w:p/>
-    <w:tbl>
-      <w:tblPr>
-        <w:tblStyle w:val="TableGrid"/>
-        <w:tblW w:type="auto" w:w="0"/>
-        <w:tblLook w:firstColumn="1" w:firstRow="1" w:lastColumn="0" w:lastRow="0" w:noHBand="0" w:noVBand="1" w:val="04A0"/>
-      </w:tblPr>
-      <w:tblGrid>
-        <w:gridCol w:w="9972"/>
-      </w:tblGrid>
-      <w:tr>
-        <w:tc>
-          <w:tcPr>
-            <w:tcW w:type="dxa" w:w="9972"/>
-            <w:shd w:val="clear" w:color="auto" w:fill="2563EB"/>
-          </w:tcPr>
-          <w:p>
-            <w:pPr>
-              <w:spacing w:before="60" w:after="60"/>
-              <w:ind w:left="120"/>
-              <w:jc w:val="left"/>
-            </w:pPr>
-            <w:r>
-              <w:rPr>
-                <w:b/>
-                <w:color w:val="FFFFFF"/>
-                <w:sz w:val="18"/>
-              </w:rPr>
-              <w:t>PROFESSIONAL SUMMARY</w:t>
-            </w:r>
-          </w:p>
-        </w:tc>
-      </w:tr>
-    </w:tbl>
     <w:p>
       <w:pPr>
-        <w:spacing w:before="80" w:after="80"/>
-        <w:ind w:left="120" w:right="120"/>
-      </w:pPr>
-      <w:r>
-        <w:rPr>
-          <w:color w:val="1A1A2E"/>
-          <w:sz w:val="18"/>
-        </w:rPr>
-        <w:t>Linux infrastructure and Site Reliability professional with 4+ years building scalable automation pipelines, SOC platforms, and AI-powered agent systems. Hands-on expertise in CI/CD pipeline engineering (Jenkins), container orchestration (Docker/Kubernetes), Infrastructure as Code (Terraform/Ansible), and Linux systems administration. Proficient in Python for automation, scripting, and REST API development. Experienced in monitoring and observability toolchain setup (Zabbix, Prometheus, Grafana) and incident response with SLA/SLO/SLI framework adherence.</w:t>
-      </w:r>
-    </w:p>
-    <w:tbl>
-      <w:tblPr>
-        <w:tblStyle w:val="TableGrid"/>
-        <w:tblW w:type="auto" w:w="0"/>
-        <w:tblLook w:firstColumn="1" w:firstRow="1" w:lastColumn="0" w:lastRow="0" w:noHBand="0" w:noVBand="1" w:val="04A0"/>
-      </w:tblPr>
-      <w:tblGrid>
-        <w:gridCol w:w="9972"/>
-      </w:tblGrid>
-      <w:tr>
-        <w:tc>
-          <w:tcPr>
-            <w:tcW w:type="dxa" w:w="9972"/>
-            <w:shd w:val="clear" w:color="auto" w:fill="2563EB"/>
-          </w:tcPr>
-          <w:p>
-            <w:pPr>
-              <w:spacing w:before="60" w:after="60"/>
-              <w:ind w:left="120"/>
-              <w:jc w:val="left"/>
-            </w:pPr>
-            <w:r>
-              <w:rPr>
-                <w:b/>
-                <w:color w:val="FFFFFF"/>
-                <w:sz w:val="18"/>
-              </w:rPr>
-              <w:t>CORE COMPETENCIES</w:t>
-            </w:r>
-          </w:p>
-        </w:tc>
-      </w:tr>
-    </w:tbl>
-    <w:tbl>
-      <w:tblPr>
-        <w:tblStyle w:val="TableGrid"/>
-        <w:tblW w:type="auto" w:w="0"/>
-        <w:tblLook w:firstColumn="1" w:firstRow="1" w:lastColumn="0" w:lastRow="0" w:noHBand="0" w:noVBand="1" w:val="04A0"/>
-      </w:tblPr>
-      <w:tblGrid>
-        <w:gridCol w:w="4986"/>
-        <w:gridCol w:w="4986"/>
-      </w:tblGrid>
-      <w:tr>
-        <w:tc>
-          <w:tcPr>
-            <w:tcW w:type="dxa" w:w="2304"/>
-            <w:shd w:val="clear" w:color="auto" w:fill="162032"/>
-          </w:tcPr>
-          <w:p>
-            <w:pPr>
-              <w:spacing w:before="40" w:after="40"/>
-              <w:ind w:left="80"/>
-            </w:pPr>
-            <w:r>
-              <w:rPr>
-                <w:b/>
-                <w:color w:val="2563EB"/>
-                <w:sz w:val="17"/>
-              </w:rPr>
-              <w:t>Site Reliability</w:t>
-            </w:r>
-          </w:p>
-        </w:tc>
-        <w:tc>
-          <w:tcPr>
-            <w:tcW w:type="dxa" w:w="7056"/>
-            <w:shd w:val="clear" w:color="auto" w:fill="FFFFFF"/>
-          </w:tcPr>
-          <w:p>
-            <w:pPr>
-              <w:spacing w:before="40" w:after="40"/>
-              <w:ind w:left="80"/>
-            </w:pPr>
-            <w:r>
-              <w:rPr>
-                <w:color w:val="1A1A2E"/>
-                <w:sz w:val="17"/>
-              </w:rPr>
-              <w:t>SRE Practices · SLA/SLO/SLI · Incident Response · On-Call · Blameless Postmortems · Runbooks</w:t>
-            </w:r>
-          </w:p>
-        </w:tc>
-      </w:tr>
-      <w:tr>
-        <w:tc>
-          <w:tcPr>
-            <w:tcW w:type="dxa" w:w="2304"/>
-            <w:shd w:val="clear" w:color="auto" w:fill="162032"/>
-          </w:tcPr>
-          <w:p>
-            <w:pPr>
-              <w:spacing w:before="40" w:after="40"/>
-              <w:ind w:left="80"/>
-            </w:pPr>
-            <w:r>
-              <w:rPr>
-                <w:b/>
-                <w:color w:val="2563EB"/>
-                <w:sz w:val="17"/>
-              </w:rPr>
-              <w:t>Cloud &amp; IaC</w:t>
-            </w:r>
-          </w:p>
-        </w:tc>
-        <w:tc>
-          <w:tcPr>
-            <w:tcW w:type="dxa" w:w="7056"/>
-            <w:shd w:val="clear" w:color="auto" w:fill="FFFFFF"/>
-          </w:tcPr>
-          <w:p>
-            <w:pPr>
-              <w:spacing w:before="40" w:after="40"/>
-              <w:ind w:left="80"/>
-            </w:pPr>
-            <w:r>
-              <w:rPr>
-                <w:color w:val="1A1A2E"/>
-                <w:sz w:val="17"/>
-              </w:rPr>
-              <w:t>AWS (S3, EC2, IAM, CLI) · Terraform · Ansible · Infrastructure as Code · Cloud Native Architecture</w:t>
-            </w:r>
-          </w:p>
-        </w:tc>
-      </w:tr>
-      <w:tr>
-        <w:tc>
-          <w:tcPr>
-            <w:tcW w:type="dxa" w:w="2304"/>
-            <w:shd w:val="clear" w:color="auto" w:fill="162032"/>
-          </w:tcPr>
-          <w:p>
-            <w:pPr>
-              <w:spacing w:before="40" w:after="40"/>
-              <w:ind w:left="80"/>
-            </w:pPr>
-            <w:r>
-              <w:rPr>
-                <w:b/>
-                <w:color w:val="2563EB"/>
-                <w:sz w:val="17"/>
-              </w:rPr>
-              <w:t>Container &amp; Orchestration</w:t>
-            </w:r>
-          </w:p>
-        </w:tc>
-        <w:tc>
-          <w:tcPr>
-            <w:tcW w:type="dxa" w:w="7056"/>
-            <w:shd w:val="clear" w:color="auto" w:fill="FFFFFF"/>
-          </w:tcPr>
-          <w:p>
-            <w:pPr>
-              <w:spacing w:before="40" w:after="40"/>
-              <w:ind w:left="80"/>
-            </w:pPr>
-            <w:r>
-              <w:rPr>
-                <w:color w:val="1A1A2E"/>
-                <w:sz w:val="17"/>
-              </w:rPr>
-              <w:t>Docker · Kubernetes (Pods/Services/Deployments) · OpenShift · Container Security · Helm Charts</w:t>
-            </w:r>
-          </w:p>
-        </w:tc>
-      </w:tr>
-      <w:tr>
-        <w:tc>
-          <w:tcPr>
-            <w:tcW w:type="dxa" w:w="2304"/>
-            <w:shd w:val="clear" w:color="auto" w:fill="162032"/>
-          </w:tcPr>
-          <w:p>
-            <w:pPr>
-              <w:spacing w:before="40" w:after="40"/>
-              <w:ind w:left="80"/>
-            </w:pPr>
-            <w:r>
-              <w:rPr>
-                <w:b/>
-                <w:color w:val="2563EB"/>
-                <w:sz w:val="17"/>
-              </w:rPr>
-              <w:t>CI/CD &amp; DevOps</w:t>
-            </w:r>
-          </w:p>
-        </w:tc>
-        <w:tc>
-          <w:tcPr>
-            <w:tcW w:type="dxa" w:w="7056"/>
-            <w:shd w:val="clear" w:color="auto" w:fill="FFFFFF"/>
-          </w:tcPr>
-          <w:p>
-            <w:pPr>
-              <w:spacing w:before="40" w:after="40"/>
-              <w:ind w:left="80"/>
-            </w:pPr>
-            <w:r>
-              <w:rPr>
-                <w:color w:val="1A1A2E"/>
-                <w:sz w:val="17"/>
-              </w:rPr>
-              <w:t>Jenkins Pipelines · Maven/Gradle · GitOps · Blue-Green Deployments · Automated Testing</w:t>
-            </w:r>
-          </w:p>
-        </w:tc>
-      </w:tr>
-      <w:tr>
-        <w:tc>
-          <w:tcPr>
-            <w:tcW w:type="dxa" w:w="2304"/>
-            <w:shd w:val="clear" w:color="auto" w:fill="162032"/>
-          </w:tcPr>
-          <w:p>
-            <w:pPr>
-              <w:spacing w:before="40" w:after="40"/>
-              <w:ind w:left="80"/>
-            </w:pPr>
-            <w:r>
-              <w:rPr>
-                <w:b/>
-                <w:color w:val="2563EB"/>
-                <w:sz w:val="17"/>
-              </w:rPr>
-              <w:t>Observability</w:t>
-            </w:r>
-          </w:p>
-        </w:tc>
-        <w:tc>
-          <w:tcPr>
-            <w:tcW w:type="dxa" w:w="7056"/>
-            <w:shd w:val="clear" w:color="auto" w:fill="FFFFFF"/>
-          </w:tcPr>
-          <w:p>
-            <w:pPr>
-              <w:spacing w:before="40" w:after="40"/>
-              <w:ind w:left="80"/>
-            </w:pPr>
-            <w:r>
-              <w:rPr>
-                <w:color w:val="1A1A2E"/>
-                <w:sz w:val="17"/>
-              </w:rPr>
-              <w:t>Zabbix · Prometheus · Grafana · ELK Stack · PagerDuty · Alertmanager · Log Aggregation</w:t>
-            </w:r>
-          </w:p>
-        </w:tc>
-      </w:tr>
-      <w:tr>
-        <w:tc>
-          <w:tcPr>
-            <w:tcW w:type="dxa" w:w="2304"/>
-            <w:shd w:val="clear" w:color="auto" w:fill="162032"/>
-          </w:tcPr>
-          <w:p>
-            <w:pPr>
-              <w:spacing w:before="40" w:after="40"/>
-              <w:ind w:left="80"/>
-            </w:pPr>
-            <w:r>
-              <w:rPr>
-                <w:b/>
-                <w:color w:val="2563EB"/>
-                <w:sz w:val="17"/>
-              </w:rPr>
-              <w:t>AI &amp; Automation</w:t>
-            </w:r>
-          </w:p>
-        </w:tc>
-        <w:tc>
-          <w:tcPr>
-            <w:tcW w:type="dxa" w:w="7056"/>
-            <w:shd w:val="clear" w:color="auto" w:fill="FFFFFF"/>
-          </w:tcPr>
-          <w:p>
-            <w:pPr>
-              <w:spacing w:before="40" w:after="40"/>
-              <w:ind w:left="80"/>
-            </w:pPr>
-            <w:r>
-              <w:rPr>
-                <w:color w:val="1A1A2E"/>
-                <w:sz w:val="17"/>
-              </w:rPr>
-              <w:t>CrewAI · LangChain · DSPy · Python scripting · REST API development · Bash automation</w:t>
-            </w:r>
-          </w:p>
-        </w:tc>
-      </w:tr>
-      <w:tr>
-        <w:tc>
-          <w:tcPr>
-            <w:tcW w:type="dxa" w:w="2304"/>
-            <w:shd w:val="clear" w:color="auto" w:fill="162032"/>
-          </w:tcPr>
-          <w:p>
-            <w:pPr>
-              <w:spacing w:before="40" w:after="40"/>
-              <w:ind w:left="80"/>
-            </w:pPr>
-            <w:r>
-              <w:rPr>
-                <w:b/>
-                <w:color w:val="2563EB"/>
-                <w:sz w:val="17"/>
-              </w:rPr>
-              <w:t>Security &amp; Compliance</w:t>
-            </w:r>
-          </w:p>
-        </w:tc>
-        <w:tc>
-          <w:tcPr>
-            <w:tcW w:type="dxa" w:w="7056"/>
-            <w:shd w:val="clear" w:color="auto" w:fill="FFFFFF"/>
-          </w:tcPr>
-          <w:p>
-            <w:pPr>
-              <w:spacing w:before="40" w:after="40"/>
-              <w:ind w:left="80"/>
-            </w:pPr>
-            <w:r>
-              <w:rPr>
-                <w:color w:val="1A1A2E"/>
-                <w:sz w:val="17"/>
-              </w:rPr>
-              <w:t>Wazuh SIEM · OpenVAS/GVM · ModSecurity WAF · TLS/SSL · Fail2ban · Firewall (iptables/firewalld)</w:t>
-            </w:r>
-          </w:p>
-        </w:tc>
-      </w:tr>
-      <w:tr>
-        <w:tc>
-          <w:tcPr>
-            <w:tcW w:type="dxa" w:w="2304"/>
-            <w:shd w:val="clear" w:color="auto" w:fill="162032"/>
-          </w:tcPr>
-          <w:p>
-            <w:pPr>
-              <w:spacing w:before="40" w:after="40"/>
-              <w:ind w:left="80"/>
-            </w:pPr>
-            <w:r>
-              <w:rPr>
-                <w:b/>
-                <w:color w:val="2563EB"/>
-                <w:sz w:val="17"/>
-              </w:rPr>
-              <w:t>Linux Administration</w:t>
-            </w:r>
-          </w:p>
-        </w:tc>
-        <w:tc>
-          <w:tcPr>
-            <w:tcW w:type="dxa" w:w="7056"/>
-            <w:shd w:val="clear" w:color="auto" w:fill="FFFFFF"/>
-          </w:tcPr>
-          <w:p>
-            <w:pPr>
-              <w:spacing w:before="40" w:after="40"/>
-              <w:ind w:left="80"/>
-            </w:pPr>
-            <w:r>
-              <w:rPr>
-                <w:color w:val="1A1A2E"/>
-                <w:sz w:val="17"/>
-              </w:rPr>
-              <w:t>RHEL/CentOS · Ubuntu Server · LVM · systemd · Kernel Tuning · SELinux · LVM · NFS · SAMBA</w:t>
-            </w:r>
-          </w:p>
-        </w:tc>
-      </w:tr>
-    </w:tbl>
-    <w:p/>
-    <w:tbl>
-      <w:tblPr>
-        <w:tblStyle w:val="TableGrid"/>
-        <w:tblW w:type="auto" w:w="0"/>
-        <w:tblLook w:firstColumn="1" w:firstRow="1" w:lastColumn="0" w:lastRow="0" w:noHBand="0" w:noVBand="1" w:val="04A0"/>
-      </w:tblPr>
-      <w:tblGrid>
-        <w:gridCol w:w="9972"/>
-      </w:tblGrid>
-      <w:tr>
-        <w:tc>
-          <w:tcPr>
-            <w:tcW w:type="dxa" w:w="9972"/>
-            <w:shd w:val="clear" w:color="auto" w:fill="2563EB"/>
-          </w:tcPr>
-          <w:p>
-            <w:pPr>
-              <w:spacing w:before="60" w:after="60"/>
-              <w:ind w:left="120"/>
-              <w:jc w:val="left"/>
-            </w:pPr>
-            <w:r>
-              <w:rPr>
-                <w:b/>
-                <w:color w:val="FFFFFF"/>
-                <w:sz w:val="18"/>
-              </w:rPr>
-              <w:t>TECHNICAL PROFICIENCY</w:t>
-            </w:r>
-          </w:p>
-        </w:tc>
-      </w:tr>
-    </w:tbl>
-    <w:p>
-      <w:pPr>
-        <w:spacing w:before="40" w:after="40"/>
-        <w:ind w:left="120"/>
+        <w:jc w:val="center"/>
       </w:pPr>
       <w:r>
         <w:rPr>
           <w:b/>
-          <w:color w:val="0D1B2A"/>
-          <w:sz w:val="18"/>
+          <w:color w:val="000000"/>
+          <w:sz w:val="44"/>
         </w:rPr>
-        <w:t xml:space="preserve">Languages: </w:t>
-      </w:r>
-      <w:r>
-        <w:rPr>
-          <w:color w:val="1A1A2E"/>
-          <w:sz w:val="18"/>
-        </w:rPr>
-        <w:t>Python · Bash · Java · Go · JavaScript/Node.js</w:t>
+        <w:t>Achu Pradeep</w:t>
       </w:r>
     </w:p>
     <w:p>
       <w:pPr>
-        <w:spacing w:before="40" w:after="40"/>
-        <w:ind w:left="120"/>
+        <w:jc w:val="center"/>
+      </w:pPr>
+      <w:r>
+        <w:rPr>
+          <w:color w:val="3C3C3C"/>
+          <w:sz w:val="22"/>
+        </w:rPr>
+        <w:t>IT Server Administrator | Linux DevOps Engineer | AI Developer | RHCSA/RHCE</w:t>
+      </w:r>
+    </w:p>
+    <w:p>
+      <w:pPr>
+        <w:jc w:val="center"/>
+      </w:pPr>
+      <w:r>
+        <w:rPr>
+          <w:color w:val="505050"/>
+          <w:sz w:val="18"/>
+        </w:rPr>
+        <w:t>achupradeep3050@gmail.com  |  +91-70557-70555  |  github.com/achupradeep3050  |  Aluva, Kerala, India</w:t>
+      </w:r>
+    </w:p>
+    <w:p/>
+    <w:p>
+      <w:pPr>
+        <w:spacing w:after="120"/>
       </w:pPr>
       <w:r>
         <w:rPr>
           <w:b/>
-          <w:color w:val="0D1B2A"/>
-          <w:sz w:val="18"/>
+          <w:color w:val="0050A0"/>
+          <w:sz w:val="26"/>
         </w:rPr>
-        <w:t xml:space="preserve">DevOps Tools: </w:t>
+        <w:t>SUMMARY</w:t>
       </w:r>
+    </w:p>
+    <w:p>
       <w:r>
         <w:rPr>
-          <w:color w:val="1A1A2E"/>
-          <w:sz w:val="18"/>
+          <w:color w:val="282828"/>
+          <w:sz w:val="20"/>
         </w:rPr>
-        <w:t>Docker · Kubernetes · Jenkins · Ansible · Terraform · Git · Maven · Gradle</w:t>
+        <w:t>Linux DevOps engineer with 2.5+ years in IT administration and a growing portfolio of AI/agentic automation projects. RHCSA + RHCE certified. Strong foundation in Linux systems, networking, security - now applying that to build AI-powered pipelines and workflows. Passionate about automating infrastructure and bringing AI agents into production. Seeking roles in Linux DevOps, SRE, AI Infrastructure, or Security Operations.</w:t>
       </w:r>
     </w:p>
     <w:p>
       <w:pPr>
-        <w:spacing w:before="40" w:after="40"/>
-        <w:ind w:left="120"/>
+        <w:spacing w:after="120"/>
       </w:pPr>
       <w:r>
         <w:rPr>
           <w:b/>
-          <w:color w:val="0D1B2A"/>
+          <w:color w:val="0050A0"/>
+          <w:sz w:val="26"/>
+        </w:rPr>
+        <w:t>WORK EXPERIENCE</w:t>
+      </w:r>
+    </w:p>
+    <w:p>
+      <w:r>
+        <w:rPr>
+          <w:b/>
+          <w:sz w:val="22"/>
+        </w:rPr>
+        <w:t>System Administrator / AI Developer - Freelance / PanApps Inc.</w:t>
+      </w:r>
+    </w:p>
+    <w:p>
+      <w:r>
+        <w:rPr>
+          <w:i/>
+          <w:color w:val="646464"/>
           <w:sz w:val="18"/>
         </w:rPr>
-        <w:t xml:space="preserve">Cloud: </w:t>
-      </w:r>
-      <w:r>
-        <w:rPr>
-          <w:color w:val="1A1A2E"/>
-          <w:sz w:val="18"/>
-        </w:rPr>
-        <w:t>AWS (S3, EC2, IAM) · Azure Ubuntu nodes</w:t>
+        <w:t>Recent</w:t>
       </w:r>
     </w:p>
     <w:p>
       <w:pPr>
-        <w:spacing w:before="40" w:after="40"/>
-        <w:ind w:left="120"/>
+        <w:pStyle w:val="ListBullet"/>
+        <w:ind w:left="360"/>
+      </w:pPr>
+      <w:r>
+        <w:rPr>
+          <w:color w:val="282828"/>
+          <w:sz w:val="20"/>
+        </w:rPr>
+        <w:t>Building AI agent pipelines and automation workflows using CrewAI, LangChain, and ScrapeGraphAI</w:t>
+      </w:r>
+    </w:p>
+    <w:p>
+      <w:pPr>
+        <w:pStyle w:val="ListBullet"/>
+        <w:ind w:left="360"/>
+      </w:pPr>
+      <w:r>
+        <w:rPr>
+          <w:color w:val="282828"/>
+          <w:sz w:val="20"/>
+        </w:rPr>
+        <w:t>Integrating AI tools into production workflows for job automation, trading, and security</w:t>
+      </w:r>
+    </w:p>
+    <w:p>
+      <w:pPr>
+        <w:pStyle w:val="ListBullet"/>
+        <w:ind w:left="360"/>
+      </w:pPr>
+      <w:r>
+        <w:rPr>
+          <w:color w:val="282828"/>
+          <w:sz w:val="20"/>
+        </w:rPr>
+        <w:t>Applying DevOps rigor to AI infrastructure - monitoring, deployment, reliability</w:t>
+      </w:r>
+    </w:p>
+    <w:p>
+      <w:r>
+        <w:rPr>
+          <w:b/>
+          <w:sz w:val="22"/>
+        </w:rPr>
+        <w:t>System Administrator - Leadership Domestic Workers Service Center</w:t>
+      </w:r>
+    </w:p>
+    <w:p>
+      <w:r>
+        <w:rPr>
+          <w:i/>
+          <w:color w:val="646464"/>
+          <w:sz w:val="18"/>
+        </w:rPr>
+        <w:t>Dec 2021 - Apr 2023</w:t>
+      </w:r>
+    </w:p>
+    <w:p>
+      <w:pPr>
+        <w:pStyle w:val="ListBullet"/>
+        <w:ind w:left="360"/>
+      </w:pPr>
+      <w:r>
+        <w:rPr>
+          <w:color w:val="282828"/>
+          <w:sz w:val="20"/>
+        </w:rPr>
+        <w:t>Installed, configured, and maintained Windows Server 2016 and Linux-based infrastructure</w:t>
+      </w:r>
+    </w:p>
+    <w:p>
+      <w:pPr>
+        <w:pStyle w:val="ListBullet"/>
+        <w:ind w:left="360"/>
+      </w:pPr>
+      <w:r>
+        <w:rPr>
+          <w:color w:val="282828"/>
+          <w:sz w:val="20"/>
+        </w:rPr>
+        <w:t>Configured LAN/WAN networks, firewalls, and secure connections for government integrations (MOHRE, ICA)</w:t>
+      </w:r>
+    </w:p>
+    <w:p>
+      <w:pPr>
+        <w:pStyle w:val="ListBullet"/>
+        <w:ind w:left="360"/>
+      </w:pPr>
+      <w:r>
+        <w:rPr>
+          <w:color w:val="282828"/>
+          <w:sz w:val="20"/>
+        </w:rPr>
+        <w:t>Managed attendance and access control systems; administered IP telephony, mail server, company website</w:t>
+      </w:r>
+    </w:p>
+    <w:p>
+      <w:pPr>
+        <w:pStyle w:val="ListBullet"/>
+        <w:ind w:left="360"/>
+      </w:pPr>
+      <w:r>
+        <w:rPr>
+          <w:color w:val="282828"/>
+          <w:sz w:val="20"/>
+        </w:rPr>
+        <w:t>Provided remote desktop support across 100+ end users; performed daily network monitoring</w:t>
+      </w:r>
+    </w:p>
+    <w:p>
+      <w:r>
+        <w:rPr>
+          <w:b/>
+          <w:sz w:val="22"/>
+        </w:rPr>
+        <w:t>Linux System Administrator - IPSR Solutions Ltd</w:t>
+      </w:r>
+    </w:p>
+    <w:p>
+      <w:r>
+        <w:rPr>
+          <w:i/>
+          <w:color w:val="646464"/>
+          <w:sz w:val="18"/>
+        </w:rPr>
+        <w:t>6 months contract</w:t>
+      </w:r>
+    </w:p>
+    <w:p>
+      <w:pPr>
+        <w:pStyle w:val="ListBullet"/>
+        <w:ind w:left="360"/>
+      </w:pPr>
+      <w:r>
+        <w:rPr>
+          <w:color w:val="282828"/>
+          <w:sz w:val="20"/>
+        </w:rPr>
+        <w:t>Administered Linux servers: kernel upgrades, firewall, SELINUX, LDAP</w:t>
+      </w:r>
+    </w:p>
+    <w:p>
+      <w:pPr>
+        <w:pStyle w:val="ListBullet"/>
+        <w:ind w:left="360"/>
+      </w:pPr>
+      <w:r>
+        <w:rPr>
+          <w:color w:val="282828"/>
+          <w:sz w:val="20"/>
+        </w:rPr>
+        <w:t>Remote support via SSH; configured Apache, SAMBA, NFS, FTP, ISCSI servers</w:t>
+      </w:r>
+    </w:p>
+    <w:p>
+      <w:pPr>
+        <w:pStyle w:val="ListBullet"/>
+        <w:ind w:left="360"/>
+      </w:pPr>
+      <w:r>
+        <w:rPr>
+          <w:color w:val="282828"/>
+          <w:sz w:val="20"/>
+        </w:rPr>
+        <w:t>Network monitoring, scheduled backups, user troubleshooting</w:t>
+      </w:r>
+    </w:p>
+    <w:p>
+      <w:r>
+        <w:rPr>
+          <w:b/>
+          <w:sz w:val="22"/>
+        </w:rPr>
+        <w:t>Network Administrator - Ravis Agencies</w:t>
+      </w:r>
+    </w:p>
+    <w:p>
+      <w:r>
+        <w:rPr>
+          <w:i/>
+          <w:color w:val="646464"/>
+          <w:sz w:val="18"/>
+        </w:rPr>
+        <w:t>Jun 2014 - Jul 2017 (Part-Time)</w:t>
+      </w:r>
+    </w:p>
+    <w:p>
+      <w:pPr>
+        <w:pStyle w:val="ListBullet"/>
+        <w:ind w:left="360"/>
+      </w:pPr>
+      <w:r>
+        <w:rPr>
+          <w:color w:val="282828"/>
+          <w:sz w:val="20"/>
+        </w:rPr>
+        <w:t>Led LAN/WAN establishment and implementation</w:t>
+      </w:r>
+    </w:p>
+    <w:p>
+      <w:pPr>
+        <w:pStyle w:val="ListBullet"/>
+        <w:ind w:left="360"/>
+      </w:pPr>
+      <w:r>
+        <w:rPr>
+          <w:color w:val="282828"/>
+          <w:sz w:val="20"/>
+        </w:rPr>
+        <w:t>Installed and configured OS; optimized system security and performance</w:t>
+      </w:r>
+    </w:p>
+    <w:p>
+      <w:pPr>
+        <w:pStyle w:val="ListBullet"/>
+        <w:ind w:left="360"/>
+      </w:pPr>
+      <w:r>
+        <w:rPr>
+          <w:color w:val="282828"/>
+          <w:sz w:val="20"/>
+        </w:rPr>
+        <w:t>Scheduled backups, monitored disk/log usage, implemented IT policies</w:t>
+      </w:r>
+    </w:p>
+    <w:p>
+      <w:pPr>
+        <w:spacing w:after="120"/>
       </w:pPr>
       <w:r>
         <w:rPr>
           <w:b/>
-          <w:color w:val="0D1B2A"/>
-          <w:sz w:val="18"/>
+          <w:color w:val="0050A0"/>
+          <w:sz w:val="26"/>
+        </w:rPr>
+        <w:t>TECHNICAL SKILLS</w:t>
+      </w:r>
+    </w:p>
+    <w:p>
+      <w:pPr>
+        <w:ind w:left="144"/>
+      </w:pPr>
+      <w:r>
+        <w:rPr>
+          <w:b/>
+          <w:color w:val="0050A0"/>
+          <w:sz w:val="20"/>
+        </w:rPr>
+        <w:t xml:space="preserve">OS &amp; Admin: </w:t>
+      </w:r>
+      <w:r>
+        <w:rPr>
+          <w:color w:val="282828"/>
+          <w:sz w:val="20"/>
+        </w:rPr>
+        <w:t>Linux (RHEL, CentOS, Fedora, Kali), Windows Server 2016, LVM, SWAP, cron, systemd</w:t>
+      </w:r>
+    </w:p>
+    <w:p>
+      <w:pPr>
+        <w:ind w:left="144"/>
+      </w:pPr>
+      <w:r>
+        <w:rPr>
+          <w:b/>
+          <w:color w:val="0050A0"/>
+          <w:sz w:val="20"/>
+        </w:rPr>
+        <w:t xml:space="preserve">Networking: </w:t>
+      </w:r>
+      <w:r>
+        <w:rPr>
+          <w:color w:val="282828"/>
+          <w:sz w:val="20"/>
+        </w:rPr>
+        <w:t>TCP/IP, LAN/WAN, DNS, DHCP, iptables/nftables, SELinux, LDAP</w:t>
+      </w:r>
+    </w:p>
+    <w:p>
+      <w:pPr>
+        <w:ind w:left="144"/>
+      </w:pPr>
+      <w:r>
+        <w:rPr>
+          <w:b/>
+          <w:color w:val="0050A0"/>
+          <w:sz w:val="20"/>
         </w:rPr>
         <w:t xml:space="preserve">Servers: </w:t>
       </w:r>
       <w:r>
         <w:rPr>
-          <w:color w:val="1A1A2E"/>
-          <w:sz w:val="18"/>
+          <w:color w:val="282828"/>
+          <w:sz w:val="20"/>
         </w:rPr>
-        <w:t>Apache httpd · Nginx · Tomcat · MariaDB/MySQL · Redis</w:t>
+        <w:t>Apache, Nginx, MySQL/MariaDB, SAMBA, NFS, FTP, ISCSI, Postfix</w:t>
       </w:r>
     </w:p>
     <w:p>
       <w:pPr>
-        <w:spacing w:before="40" w:after="40"/>
-        <w:ind w:left="120"/>
+        <w:ind w:left="144"/>
       </w:pPr>
       <w:r>
         <w:rPr>
           <w:b/>
-          <w:color w:val="0D1B2A"/>
-          <w:sz w:val="18"/>
+          <w:color w:val="0050A0"/>
+          <w:sz w:val="20"/>
         </w:rPr>
-        <w:t xml:space="preserve">AI Stack: </w:t>
+        <w:t xml:space="preserve">DevOps &amp; Cloud: </w:t>
       </w:r>
       <w:r>
         <w:rPr>
-          <w:color w:val="1A1A2E"/>
-          <w:sz w:val="18"/>
+          <w:color w:val="282828"/>
+          <w:sz w:val="20"/>
         </w:rPr>
-        <w:t>CrewAI · LangChain · DSPy · ScrapeGraphAI · TradingView MCP</w:t>
+        <w:t>Docker, systemd, Apache NiFi, Zabbix, Wazuh SIEM, AWS S3 Backup, CI/CD</w:t>
       </w:r>
     </w:p>
     <w:p>
       <w:pPr>
-        <w:spacing w:before="40" w:after="40"/>
-        <w:ind w:left="120"/>
+        <w:ind w:left="144"/>
       </w:pPr>
       <w:r>
         <w:rPr>
           <w:b/>
-          <w:color w:val="0D1B2A"/>
-          <w:sz w:val="18"/>
+          <w:color w:val="0050A0"/>
+          <w:sz w:val="20"/>
         </w:rPr>
-        <w:t xml:space="preserve">Monitoring: </w:t>
+        <w:t xml:space="preserve">AI / Agentic: </w:t>
       </w:r>
       <w:r>
         <w:rPr>
-          <w:color w:val="1A1A2E"/>
-          <w:sz w:val="18"/>
+          <w:color w:val="282828"/>
+          <w:sz w:val="20"/>
         </w:rPr>
-        <w:t>Zabbix · Prometheus · Grafana · Loki · PagerDuty</w:t>
+        <w:t>Python, CrewAI, LangChain, DSPy, ScrapeGraphAI, Hugging Face, AgentDB (HNSW), LangGraph</w:t>
       </w:r>
     </w:p>
-    <w:p/>
-    <w:tbl>
-      <w:tblPr>
-        <w:tblStyle w:val="TableGrid"/>
-        <w:tblW w:type="auto" w:w="0"/>
-        <w:tblLook w:firstColumn="1" w:firstRow="1" w:lastColumn="0" w:lastRow="0" w:noHBand="0" w:noVBand="1" w:val="04A0"/>
-      </w:tblPr>
-      <w:tblGrid>
-        <w:gridCol w:w="9972"/>
-      </w:tblGrid>
-      <w:tr>
-        <w:tc>
-          <w:tcPr>
-            <w:tcW w:type="dxa" w:w="9972"/>
-            <w:shd w:val="clear" w:color="auto" w:fill="2563EB"/>
-          </w:tcPr>
-          <w:p>
-            <w:pPr>
-              <w:spacing w:before="60" w:after="60"/>
-              <w:ind w:left="120"/>
-              <w:jc w:val="left"/>
-            </w:pPr>
-            <w:r>
-              <w:rPr>
-                <w:b/>
-                <w:color w:val="FFFFFF"/>
-                <w:sz w:val="18"/>
-              </w:rPr>
-              <w:t>WORK EXPERIENCE</w:t>
-            </w:r>
-          </w:p>
-        </w:tc>
-      </w:tr>
-    </w:tbl>
-    <w:tbl>
-      <w:tblPr>
-        <w:tblStyle w:val="TableGrid"/>
-        <w:tblW w:type="auto" w:w="0"/>
-        <w:tblLook w:firstColumn="1" w:firstRow="1" w:lastColumn="0" w:lastRow="0" w:noHBand="0" w:noVBand="1" w:val="04A0"/>
-      </w:tblPr>
-      <w:tblGrid>
-        <w:gridCol w:w="4986"/>
-        <w:gridCol w:w="4986"/>
-      </w:tblGrid>
-      <w:tr>
-        <w:tc>
-          <w:tcPr>
-            <w:tcW w:type="dxa" w:w="4986"/>
-            <w:shd w:val="clear" w:color="auto" w:fill="FFFFFF"/>
-          </w:tcPr>
-          <w:p>
-            <w:pPr>
-              <w:spacing w:before="80" w:after="20"/>
-            </w:pPr>
-            <w:r>
-              <w:rPr>
-                <w:b/>
-                <w:color w:val="2563EB"/>
-                <w:sz w:val="20"/>
-              </w:rPr>
-              <w:t>DevOps Engineer  |  PanApps Inc.</w:t>
-            </w:r>
-          </w:p>
-          <w:p>
-            <w:pPr>
-              <w:spacing w:before="0" w:after="80"/>
-            </w:pPr>
-            <w:r>
-              <w:rPr>
-                <w:color w:val="94A3B8"/>
-              </w:rPr>
-              <w:t>Jan 2024 – Present  |  Kerala, India</w:t>
-            </w:r>
-          </w:p>
-        </w:tc>
-        <w:tc>
-          <w:tcPr>
-            <w:tcW w:type="dxa" w:w="4986"/>
-          </w:tcPr>
-          <w:p/>
-        </w:tc>
-      </w:tr>
-    </w:tbl>
     <w:p>
       <w:pPr>
-        <w:pStyle w:val="ListBullet"/>
-        <w:spacing w:before="20" w:after="20"/>
-        <w:ind w:left="240"/>
+        <w:ind w:left="144"/>
       </w:pPr>
       <w:r>
         <w:rPr>
-          <w:color w:val="1A1A2E"/>
+          <w:b/>
+          <w:color w:val="0050A0"/>
+          <w:sz w:val="20"/>
+        </w:rPr>
+        <w:t xml:space="preserve">Trading Tech: </w:t>
+      </w:r>
+      <w:r>
+        <w:rPr>
+          <w:color w:val="282828"/>
+          <w:sz w:val="20"/>
+        </w:rPr>
+        <w:t>Pine Script v5, TradingView MCP, XAUUSD algos, FVG/SMC/ICT strategies</w:t>
+      </w:r>
+    </w:p>
+    <w:p>
+      <w:pPr>
+        <w:ind w:left="144"/>
+      </w:pPr>
+      <w:r>
+        <w:rPr>
+          <w:b/>
+          <w:color w:val="0050A0"/>
+          <w:sz w:val="20"/>
+        </w:rPr>
+        <w:t xml:space="preserve">Certifications: </w:t>
+      </w:r>
+      <w:r>
+        <w:rPr>
+          <w:color w:val="282828"/>
+          <w:sz w:val="20"/>
+        </w:rPr>
+        <w:t>RHCSA (ID: 170-179-113), RHCE, Certified Ethical Hacking</w:t>
+      </w:r>
+    </w:p>
+    <w:p>
+      <w:pPr>
+        <w:spacing w:after="120"/>
+      </w:pPr>
+      <w:r>
+        <w:rPr>
+          <w:b/>
+          <w:color w:val="0050A0"/>
+          <w:sz w:val="26"/>
+        </w:rPr>
+        <w:t>PROJECTS (github.com/achupradeep3050)</w:t>
+      </w:r>
+    </w:p>
+    <w:p>
+      <w:pPr>
+        <w:ind w:left="144"/>
+      </w:pPr>
+      <w:r>
+        <w:rPr>
+          <w:b/>
+          <w:sz w:val="20"/>
+        </w:rPr>
+        <w:t>jobmind-agent</w:t>
+      </w:r>
+      <w:r>
+        <w:rPr>
+          <w:color w:val="3C3C3C"/>
           <w:sz w:val="18"/>
         </w:rPr>
-        <w:t>SRE Practices: Defined and monitored SLA/SLO/SLI for 20+ enterprise Linux endpoints; maintained 99.9% uptime via Zabbix alerting thresholds, runbooks, and incident response on-call rotations and conducted blameless postmortems to drive systemic improvements</w:t>
+        <w:t xml:space="preserve"> - CrewAI multi-agent job application pipeline - resume tailoring per job, cover letter generation, interview prep, job portal scanning. Deployed live with Streamlit UI.</w:t>
+      </w:r>
+    </w:p>
+    <w:p>
+      <w:pPr>
+        <w:ind w:left="144"/>
+      </w:pPr>
+      <w:r>
+        <w:rPr>
+          <w:b/>
+          <w:sz w:val="20"/>
+        </w:rPr>
+        <w:t>VA-Opensource-Audit</w:t>
+      </w:r>
+      <w:r>
+        <w:rPr>
+          <w:color w:val="3C3C3C"/>
+          <w:sz w:val="18"/>
+        </w:rPr>
+        <w:t xml:space="preserve"> - Self-hosted SOC dashboard for agentless vulnerability auditing. ClamAV antivirus management and OpenVAS/GVM scanning across Linux servers.</w:t>
+      </w:r>
+    </w:p>
+    <w:p>
+      <w:pPr>
+        <w:ind w:left="144"/>
+      </w:pPr>
+      <w:r>
+        <w:rPr>
+          <w:b/>
+          <w:sz w:val="20"/>
+        </w:rPr>
+        <w:t>xauusd-fvg-algo</w:t>
+      </w:r>
+      <w:r>
+        <w:rPr>
+          <w:color w:val="3C3C3C"/>
+          <w:sz w:val="18"/>
+        </w:rPr>
+        <w:t xml:space="preserve"> - XAUUSD multi-broker automated gold trading system. EMA 20/50 bias + Fair Value Gap (FVG) entries. OANDA + TOOBIT integration. React dashboard with TradingView-style charts and Telegram alerts.</w:t>
+      </w:r>
+    </w:p>
+    <w:p>
+      <w:pPr>
+        <w:ind w:left="144"/>
+      </w:pPr>
+      <w:r>
+        <w:rPr>
+          <w:b/>
+          <w:sz w:val="20"/>
+        </w:rPr>
+        <w:t>sma_cross_scalp_bot</w:t>
+      </w:r>
+      <w:r>
+        <w:rPr>
+          <w:color w:val="3C3C3C"/>
+          <w:sz w:val="18"/>
+        </w:rPr>
+        <w:t xml:space="preserve"> - 24/7 automated forex/CFD scalping bot. SMA 8/21/50 crossover on M1 timeframe. React dashboard, 75% profit booking logic, ATR consolidation filter.</w:t>
+      </w:r>
+    </w:p>
+    <w:p>
+      <w:pPr>
+        <w:ind w:left="144"/>
+      </w:pPr>
+      <w:r>
+        <w:rPr>
+          <w:b/>
+          <w:sz w:val="20"/>
+        </w:rPr>
+        <w:t>my-brain</w:t>
+      </w:r>
+      <w:r>
+        <w:rPr>
+          <w:color w:val="3C3C3C"/>
+          <w:sz w:val="18"/>
+        </w:rPr>
+        <w:t xml:space="preserve"> - Personal AI brain - knowledge management system with vector embeddings and semantic search for persistent AI agent memory.</w:t>
+      </w:r>
+    </w:p>
+    <w:p>
+      <w:pPr>
+        <w:ind w:left="144"/>
+      </w:pPr>
+      <w:r>
+        <w:rPr>
+          <w:b/>
+          <w:sz w:val="20"/>
+        </w:rPr>
+        <w:t>OBStat</w:t>
+      </w:r>
+      <w:r>
+        <w:rPr>
+          <w:color w:val="3C3C3C"/>
+          <w:sz w:val="18"/>
+        </w:rPr>
+        <w:t xml:space="preserve"> - Order book analytics and statistics platform. Market microstructure analysis for algorithmic trading research.</w:t>
+      </w:r>
+    </w:p>
+    <w:p>
+      <w:pPr>
+        <w:ind w:left="144"/>
+      </w:pPr>
+      <w:r>
+        <w:rPr>
+          <w:b/>
+          <w:sz w:val="20"/>
+        </w:rPr>
+        <w:t>crypto</w:t>
+      </w:r>
+      <w:r>
+        <w:rPr>
+          <w:color w:val="3C3C3C"/>
+          <w:sz w:val="18"/>
+        </w:rPr>
+        <w:t xml:space="preserve"> - Algorithmic trading system for XAUUSD and crypto markets. Python-based real-time price analysis and execution pipeline.</w:t>
+      </w:r>
+    </w:p>
+    <w:p>
+      <w:pPr>
+        <w:spacing w:after="120"/>
+      </w:pPr>
+      <w:r>
+        <w:rPr>
+          <w:b/>
+          <w:color w:val="0050A0"/>
+          <w:sz w:val="26"/>
+        </w:rPr>
+        <w:t>COMMUNITY CONTRIBUTIONS</w:t>
+      </w:r>
+    </w:p>
+    <w:p>
+      <w:r>
+        <w:rPr>
+          <w:color w:val="282828"/>
+          <w:sz w:val="20"/>
+        </w:rPr>
+        <w:t>Actively contributing to high-impact open source AI projects:</w:t>
       </w:r>
     </w:p>
     <w:p>
       <w:pPr>
         <w:pStyle w:val="ListBullet"/>
-        <w:spacing w:before="20" w:after="20"/>
-        <w:ind w:left="240"/>
+        <w:ind w:left="360"/>
       </w:pPr>
       <w:r>
         <w:rPr>
-          <w:color w:val="1A1A2E"/>
-          <w:sz w:val="18"/>
+          <w:color w:val="282828"/>
+          <w:sz w:val="20"/>
         </w:rPr>
-        <w:t>CI/CD Pipeline Engineering: Designed and maintained Jenkins pipelines with automated build, test, and blue-green deployment workflows for enterprise applications</w:t>
+        <w:t>ruflo (40k+ stars) - AI Agent Orchestration Platform for Claude</w:t>
       </w:r>
     </w:p>
     <w:p>
       <w:pPr>
         <w:pStyle w:val="ListBullet"/>
-        <w:spacing w:before="20" w:after="20"/>
-        <w:ind w:left="240"/>
+        <w:ind w:left="360"/>
       </w:pPr>
       <w:r>
         <w:rPr>
-          <w:color w:val="1A1A2E"/>
-          <w:sz w:val="18"/>
+          <w:color w:val="282828"/>
+          <w:sz w:val="20"/>
         </w:rPr>
-        <w:t>Infrastructure as Code: Automated cloud resource provisioning using Terraform scripts; managed AWS S3 backup rotation with 30-day retention policy via Bash + AWS CLI</w:t>
+        <w:t>RuView (59k+ stars) - WiFi CSI Spatial Intelligence Platform</w:t>
       </w:r>
     </w:p>
     <w:p>
       <w:pPr>
         <w:pStyle w:val="ListBullet"/>
-        <w:spacing w:before="20" w:after="20"/>
-        <w:ind w:left="240"/>
+        <w:ind w:left="360"/>
       </w:pPr>
       <w:r>
         <w:rPr>
-          <w:color w:val="1A1A2E"/>
-          <w:sz w:val="18"/>
+          <w:color w:val="282828"/>
+          <w:sz w:val="20"/>
         </w:rPr>
-        <w:t>Container Orchestration: Deployed and managed Docker containers across staging/production; evaluated Kubernetes for microservice workloads</w:t>
+        <w:t>RuVector (4k+ stars) - Real-Time Self-Learning Vector GNN Engine</w:t>
       </w:r>
     </w:p>
     <w:p>
       <w:pPr>
-        <w:pStyle w:val="ListBullet"/>
-        <w:spacing w:before="20" w:after="20"/>
-        <w:ind w:left="240"/>
+        <w:spacing w:after="120"/>
       </w:pPr>
       <w:r>
         <w:rPr>
-          <w:color w:val="1A1A2E"/>
-          <w:sz w:val="18"/>
+          <w:b/>
+          <w:color w:val="0050A0"/>
+          <w:sz w:val="26"/>
         </w:rPr>
-        <w:t>Monitoring &amp; Observability: Configured Zabbix dashboards for 20+ endpoints; implemented log aggregation pipelines with Apache httpd access log analysis and alerting integration</w:t>
+        <w:t>EDUCATION</w:t>
+      </w:r>
+    </w:p>
+    <w:p>
+      <w:r>
+        <w:rPr>
+          <w:color w:val="282828"/>
+          <w:sz w:val="20"/>
+        </w:rPr>
+        <w:t>Bachelor of Computer Applications (BCA) - Rabindranath Tagore University</w:t>
+      </w:r>
+    </w:p>
+    <w:p>
+      <w:r>
+        <w:rPr>
+          <w:color w:val="282828"/>
+          <w:sz w:val="20"/>
+        </w:rPr>
+        <w:t>Bachelor of Commerce with Computer Application - Kerala University</w:t>
+      </w:r>
+    </w:p>
+    <w:p>
+      <w:r>
+        <w:rPr>
+          <w:color w:val="282828"/>
+          <w:sz w:val="20"/>
+        </w:rPr>
+        <w:t>12th - CBSE</w:t>
+      </w:r>
+    </w:p>
+    <w:p>
+      <w:r>
+        <w:rPr>
+          <w:color w:val="282828"/>
+          <w:sz w:val="20"/>
+        </w:rPr>
+        <w:t>10th - CBSE</w:t>
       </w:r>
     </w:p>
     <w:p>
       <w:pPr>
-        <w:pStyle w:val="ListBullet"/>
-        <w:spacing w:before="20" w:after="20"/>
-        <w:ind w:left="240"/>
+        <w:spacing w:after="120"/>
       </w:pPr>
       <w:r>
         <w:rPr>
-          <w:color w:val="1A1A2E"/>
-          <w:sz w:val="18"/>
+          <w:b/>
+          <w:color w:val="0050A0"/>
+          <w:sz w:val="26"/>
         </w:rPr>
-        <w:t>Security Automation: Integrated OpenVAS/GVM vulnerability scanning and Wazuh SIEM alert correlation with Redmine ticketing; configured ModSecurity WAF rules on Apache httpd</w:t>
+        <w:t>CERTIFICATIONS</w:t>
       </w:r>
     </w:p>
     <w:p>
-      <w:pPr>
-        <w:pStyle w:val="ListBullet"/>
-        <w:spacing w:before="20" w:after="20"/>
-        <w:ind w:left="240"/>
-      </w:pPr>
       <w:r>
         <w:rPr>
-          <w:color w:val="1A1A2E"/>
-          <w:sz w:val="18"/>
+          <w:color w:val="282828"/>
+          <w:sz w:val="20"/>
         </w:rPr>
-        <w:t>AI Agent Development: Built CrewAI multi-agent pipelines for autonomous trading research and job search automation, integrating TradingView MCP and ScrapeGraphAI</w:t>
+        <w:t>Red Hat Certified System Administrator (RHCSA) - Cert ID: 170-179-113</w:t>
       </w:r>
     </w:p>
     <w:p>
-      <w:pPr>
-        <w:pStyle w:val="ListBullet"/>
-        <w:spacing w:before="20" w:after="20"/>
-        <w:ind w:left="240"/>
-      </w:pPr>
       <w:r>
         <w:rPr>
-          <w:color w:val="1A1A2E"/>
-          <w:sz w:val="18"/>
+          <w:color w:val="282828"/>
+          <w:sz w:val="20"/>
         </w:rPr>
-        <w:t>Linux Administration: RHEL/CentOS 7–9 server management — kernel tuning, LVM on nvme, systemd service management, SELinux enforcing mode, firewall policies</w:t>
-      </w:r>
-    </w:p>
-    <w:p/>
-    <w:tbl>
-      <w:tblPr>
-        <w:tblStyle w:val="TableGrid"/>
-        <w:tblW w:type="auto" w:w="0"/>
-        <w:tblLook w:firstColumn="1" w:firstRow="1" w:lastColumn="0" w:lastRow="0" w:noHBand="0" w:noVBand="1" w:val="04A0"/>
-      </w:tblPr>
-      <w:tblGrid>
-        <w:gridCol w:w="4986"/>
-        <w:gridCol w:w="4986"/>
-      </w:tblGrid>
-      <w:tr>
-        <w:tc>
-          <w:tcPr>
-            <w:tcW w:type="dxa" w:w="4986"/>
-            <w:shd w:val="clear" w:color="auto" w:fill="FFFFFF"/>
-          </w:tcPr>
-          <w:p>
-            <w:pPr>
-              <w:spacing w:before="80" w:after="20"/>
-            </w:pPr>
-            <w:r>
-              <w:rPr>
-                <w:b/>
-                <w:color w:val="2563EB"/>
-                <w:sz w:val="20"/>
-              </w:rPr>
-              <w:t>System Administrator  |  Leadership Domestic Workers SC</w:t>
-            </w:r>
-          </w:p>
-          <w:p>
-            <w:pPr>
-              <w:spacing w:before="0" w:after="80"/>
-            </w:pPr>
-            <w:r>
-              <w:rPr>
-                <w:color w:val="94A3B8"/>
-              </w:rPr>
-              <w:t>Dec 2021 – Dec 2023  |  Kerala, India</w:t>
-            </w:r>
-          </w:p>
-        </w:tc>
-        <w:tc>
-          <w:tcPr>
-            <w:tcW w:type="dxa" w:w="4986"/>
-          </w:tcPr>
-          <w:p/>
-        </w:tc>
-      </w:tr>
-    </w:tbl>
-    <w:p>
-      <w:pPr>
-        <w:pStyle w:val="ListBullet"/>
-        <w:spacing w:before="20" w:after="20"/>
-        <w:ind w:left="240"/>
-      </w:pPr>
-      <w:r>
-        <w:rPr>
-          <w:color w:val="1A1A2E"/>
-          <w:sz w:val="18"/>
-        </w:rPr>
-        <w:t>Full-stack Linux infrastructure management for 30+ endpoint LAN — wired/wireless, DNS/DHCP, Samba file server, VPN (OpenVPN split tunneling)</w:t>
+        <w:t>Red Hat Certified Engineer (RHCE)</w:t>
       </w:r>
     </w:p>
     <w:p>
-      <w:pPr>
-        <w:pStyle w:val="ListBullet"/>
-        <w:spacing w:before="20" w:after="20"/>
-        <w:ind w:left="240"/>
-      </w:pPr>
       <w:r>
         <w:rPr>
-          <w:color w:val="1A1A2E"/>
-          <w:sz w:val="18"/>
+          <w:color w:val="282828"/>
+          <w:sz w:val="20"/>
         </w:rPr>
-        <w:t>Deployed and administered Redmine 6.0 on RHEL for ITSM ticketing; integrated automated backup via rsync to external NAS storage</w:t>
-      </w:r>
-    </w:p>
-    <w:p>
-      <w:pPr>
-        <w:pStyle w:val="ListBullet"/>
-        <w:spacing w:before="20" w:after="20"/>
-        <w:ind w:left="240"/>
-      </w:pPr>
-      <w:r>
-        <w:rPr>
-          <w:color w:val="1A1A2E"/>
-          <w:sz w:val="18"/>
-        </w:rPr>
-        <w:t>Configured Apache httpd reverse proxy with VirtualHost, SSL/TLS (Let's Encrypt), htpasswd authentication for internal web applications</w:t>
-      </w:r>
-    </w:p>
-    <w:p/>
-    <w:tbl>
-      <w:tblPr>
-        <w:tblStyle w:val="TableGrid"/>
-        <w:tblW w:type="auto" w:w="0"/>
-        <w:tblLook w:firstColumn="1" w:firstRow="1" w:lastColumn="0" w:lastRow="0" w:noHBand="0" w:noVBand="1" w:val="04A0"/>
-      </w:tblPr>
-      <w:tblGrid>
-        <w:gridCol w:w="4986"/>
-        <w:gridCol w:w="4986"/>
-      </w:tblGrid>
-      <w:tr>
-        <w:tc>
-          <w:tcPr>
-            <w:tcW w:type="dxa" w:w="4986"/>
-            <w:shd w:val="clear" w:color="auto" w:fill="FFFFFF"/>
-          </w:tcPr>
-          <w:p>
-            <w:pPr>
-              <w:spacing w:before="80" w:after="20"/>
-            </w:pPr>
-            <w:r>
-              <w:rPr>
-                <w:b/>
-                <w:color w:val="2563EB"/>
-                <w:sz w:val="20"/>
-              </w:rPr>
-              <w:t>Linux System Administrator  |  IPSR Solutions Ltd</w:t>
-            </w:r>
-          </w:p>
-          <w:p>
-            <w:pPr>
-              <w:spacing w:before="0" w:after="80"/>
-            </w:pPr>
-            <w:r>
-              <w:rPr>
-                <w:color w:val="94A3B8"/>
-              </w:rPr>
-              <w:t>2020 – 2022  |  Kerala, India</w:t>
-            </w:r>
-          </w:p>
-        </w:tc>
-        <w:tc>
-          <w:tcPr>
-            <w:tcW w:type="dxa" w:w="4986"/>
-          </w:tcPr>
-          <w:p/>
-        </w:tc>
-      </w:tr>
-    </w:tbl>
-    <w:p>
-      <w:pPr>
-        <w:pStyle w:val="ListBullet"/>
-        <w:spacing w:before="20" w:after="20"/>
-        <w:ind w:left="240"/>
-      </w:pPr>
-      <w:r>
-        <w:rPr>
-          <w:color w:val="1A1A2E"/>
-          <w:sz w:val="18"/>
-        </w:rPr>
-        <w:t>Administered RHEL/AlmaLinux workstations — DNF package management, Red Hat subscription, kernel and performance tuning</w:t>
-      </w:r>
-    </w:p>
-    <w:p>
-      <w:pPr>
-        <w:pStyle w:val="ListBullet"/>
-        <w:spacing w:before="20" w:after="20"/>
-        <w:ind w:left="240"/>
-      </w:pPr>
-      <w:r>
-        <w:rPr>
-          <w:color w:val="1A1A2E"/>
-          <w:sz w:val="18"/>
-        </w:rPr>
-        <w:t>Configured Apache httpd with VirtualHost, SSL CipherSuite hardening, and ModSecurity WAF for secure web serving</w:t>
-      </w:r>
-    </w:p>
-    <w:p>
-      <w:pPr>
-        <w:pStyle w:val="ListBullet"/>
-        <w:spacing w:before="20" w:after="20"/>
-        <w:ind w:left="240"/>
-      </w:pPr>
-      <w:r>
-        <w:rPr>
-          <w:color w:val="1A1A2E"/>
-          <w:sz w:val="18"/>
-        </w:rPr>
-        <w:t>Performed DoS mitigation using fail2ban; analyzed Apache access logs (IP frequency distribution) to block malicious traffic</w:t>
-      </w:r>
-    </w:p>
-    <w:p>
-      <w:pPr>
-        <w:pStyle w:val="ListBullet"/>
-        <w:spacing w:before="20" w:after="20"/>
-        <w:ind w:left="240"/>
-      </w:pPr>
-      <w:r>
-        <w:rPr>
-          <w:color w:val="1A1A2E"/>
-          <w:sz w:val="18"/>
-        </w:rPr>
-        <w:t>Set up LVM partitions on nvme drives (25GB swap + root), log rotation via cron and systemd timers</w:t>
-      </w:r>
-    </w:p>
-    <w:p>
-      <w:pPr>
-        <w:pStyle w:val="ListBullet"/>
-        <w:spacing w:before="20" w:after="20"/>
-        <w:ind w:left="240"/>
-      </w:pPr>
-      <w:r>
-        <w:rPr>
-          <w:color w:val="1A1A2E"/>
-          <w:sz w:val="18"/>
-        </w:rPr>
-        <w:t>Assisted in PHP 8.2 → 8.3 migration on Amazon Linux 2 and multiple .NET SDK version management</w:t>
-      </w:r>
-    </w:p>
-    <w:p/>
-    <w:tbl>
-      <w:tblPr>
-        <w:tblStyle w:val="TableGrid"/>
-        <w:tblW w:type="auto" w:w="0"/>
-        <w:tblLook w:firstColumn="1" w:firstRow="1" w:lastColumn="0" w:lastRow="0" w:noHBand="0" w:noVBand="1" w:val="04A0"/>
-      </w:tblPr>
-      <w:tblGrid>
-        <w:gridCol w:w="9972"/>
-      </w:tblGrid>
-      <w:tr>
-        <w:tc>
-          <w:tcPr>
-            <w:tcW w:type="dxa" w:w="9972"/>
-            <w:shd w:val="clear" w:color="auto" w:fill="2563EB"/>
-          </w:tcPr>
-          <w:p>
-            <w:pPr>
-              <w:spacing w:before="60" w:after="60"/>
-              <w:ind w:left="120"/>
-              <w:jc w:val="left"/>
-            </w:pPr>
-            <w:r>
-              <w:rPr>
-                <w:b/>
-                <w:color w:val="FFFFFF"/>
-                <w:sz w:val="18"/>
-              </w:rPr>
-              <w:t>CERTIFICATIONS &amp; EDUCATION</w:t>
-            </w:r>
-          </w:p>
-        </w:tc>
-      </w:tr>
-    </w:tbl>
-    <w:tbl>
-      <w:tblPr>
-        <w:tblStyle w:val="TableGrid"/>
-        <w:tblW w:type="auto" w:w="0"/>
-        <w:tblLook w:firstColumn="1" w:firstRow="1" w:lastColumn="0" w:lastRow="0" w:noHBand="0" w:noVBand="1" w:val="04A0"/>
-      </w:tblPr>
-      <w:tblGrid>
-        <w:gridCol w:w="3324"/>
-        <w:gridCol w:w="3324"/>
-        <w:gridCol w:w="3324"/>
-      </w:tblGrid>
-      <w:tr>
-        <w:tc>
-          <w:tcPr>
-            <w:tcW w:type="dxa" w:w="3324"/>
-            <w:shd w:val="clear" w:color="auto" w:fill="2563EB"/>
-          </w:tcPr>
-          <w:p>
-            <w:pPr>
-              <w:spacing w:before="80" w:after="80"/>
-              <w:jc w:val="center"/>
-            </w:pPr>
-            <w:r>
-              <w:rPr>
-                <w:b/>
-                <w:color w:val="FFFFFF"/>
-                <w:sz w:val="18"/>
-              </w:rPr>
-              <w:t>RHCSA</w:t>
-            </w:r>
-          </w:p>
-        </w:tc>
-        <w:tc>
-          <w:tcPr>
-            <w:tcW w:type="dxa" w:w="3324"/>
-            <w:shd w:val="clear" w:color="auto" w:fill="2563EB"/>
-          </w:tcPr>
-          <w:p>
-            <w:pPr>
-              <w:spacing w:before="80" w:after="80"/>
-              <w:jc w:val="center"/>
-            </w:pPr>
-            <w:r>
-              <w:rPr>
-                <w:b/>
-                <w:color w:val="FFFFFF"/>
-                <w:sz w:val="18"/>
-              </w:rPr>
-              <w:t>RHCE</w:t>
-            </w:r>
-          </w:p>
-        </w:tc>
-        <w:tc>
-          <w:tcPr>
-            <w:tcW w:type="dxa" w:w="3324"/>
-            <w:shd w:val="clear" w:color="auto" w:fill="2563EB"/>
-          </w:tcPr>
-          <w:p>
-            <w:pPr>
-              <w:spacing w:before="80" w:after="80"/>
-              <w:jc w:val="center"/>
-            </w:pPr>
-            <w:r>
-              <w:rPr>
-                <w:b/>
-                <w:color w:val="FFFFFF"/>
-                <w:sz w:val="18"/>
-              </w:rPr>
-              <w:t>Education</w:t>
-            </w:r>
-          </w:p>
-        </w:tc>
-      </w:tr>
-      <w:tr>
-        <w:tc>
-          <w:tcPr>
-            <w:tcW w:type="dxa" w:w="3324"/>
-            <w:shd w:val="clear" w:color="auto" w:fill="FFFFFF"/>
-          </w:tcPr>
-          <w:p>
-            <w:pPr>
-              <w:spacing w:before="80" w:after="80"/>
-              <w:jc w:val="center"/>
-            </w:pPr>
-            <w:r>
-              <w:rPr>
-                <w:color w:val="1A1A2E"/>
-                <w:sz w:val="17"/>
-              </w:rPr>
-              <w:t>Red Hat Certified</w:t>
-              <w:br/>
-              <w:t>System Administrator</w:t>
-              <w:br/>
-              <w:t>Cert ID: 170-179-113</w:t>
-            </w:r>
-          </w:p>
-        </w:tc>
-        <w:tc>
-          <w:tcPr>
-            <w:tcW w:type="dxa" w:w="3324"/>
-            <w:shd w:val="clear" w:color="auto" w:fill="FFFFFF"/>
-          </w:tcPr>
-          <w:p>
-            <w:pPr>
-              <w:spacing w:before="80" w:after="80"/>
-              <w:jc w:val="center"/>
-            </w:pPr>
-            <w:r>
-              <w:rPr>
-                <w:color w:val="1A1A2E"/>
-                <w:sz w:val="17"/>
-              </w:rPr>
-              <w:t>Red Hat Certified</w:t>
-              <w:br/>
-              <w:t>Engineer</w:t>
-              <w:br/>
-              <w:t>Cert ID: 170-179-113</w:t>
-            </w:r>
-          </w:p>
-        </w:tc>
-        <w:tc>
-          <w:tcPr>
-            <w:tcW w:type="dxa" w:w="3324"/>
-            <w:shd w:val="clear" w:color="auto" w:fill="FFFFFF"/>
-          </w:tcPr>
-          <w:p>
-            <w:pPr>
-              <w:spacing w:before="80" w:after="80"/>
-              <w:jc w:val="center"/>
-            </w:pPr>
-            <w:r>
-              <w:rPr>
-                <w:color w:val="1A1A2E"/>
-                <w:sz w:val="17"/>
-              </w:rPr>
-              <w:t>BCA — Bachelor of</w:t>
-              <w:br/>
-              <w:t>Computer Applications</w:t>
-              <w:br/>
-              <w:t>Rabindranath Tagore University</w:t>
-            </w:r>
-          </w:p>
-        </w:tc>
-      </w:tr>
-    </w:tbl>
-    <w:p/>
-    <w:p>
-      <w:pPr>
-        <w:spacing w:before="80" w:after="80"/>
-        <w:jc w:val="center"/>
-      </w:pPr>
-      <w:r>
-        <w:rPr>
-          <w:i/>
-          <w:color w:val="94A3B8"/>
-          <w:sz w:val="15"/>
-        </w:rPr>
-        <w:t>ATS Optimized  |  Keywords: Site Reliability Engineer · SRE · DevOps · Kubernetes · Docker · Terraform · Ansible · Jenkins · Python · AWS · GCP · Linux · RHEL · CentOS · CI/CD · IaC · Prometheus · Grafana · Zabbix · SLA · SLO · SLI · Incident Response · On-Call · Runbooks · Blameless Postmortem · Container Orchestration · Docker · Security Operations · Wazuh SIEM · OpenVAS · ModSecurity · Apache NiFi · CrewAI · LangChain</w:t>
+        <w:t>Certified Ethical Hacking</w:t>
       </w:r>
     </w:p>
     <w:sectPr>
       <w:pgSz w:w="12240" w:h="15840"/>
-      <w:pgMar w:top="850" w:right="1134" w:bottom="850" w:left="1134" w:header="720" w:footer="720" w:gutter="0"/>
+      <w:pgMar w:top="720" w:right="864" w:bottom="720" w:left="864" w:header="720" w:footer="720" w:gutter="0"/>
       <w:cols w:space="720"/>
       <w:docGrid w:linePitch="360"/>
     </w:sectPr>

</xml_diff>

<commit_message>
Fix: Regenerate DOCX with correct experience — DevOps Engineer at PanApps only
</commit_message>
<xml_diff>
--- a/Achu_Pradeep_Resume.docx
+++ b/Achu_Pradeep_Resume.docx
@@ -10,7 +10,7 @@
         <w:rPr>
           <w:b/>
           <w:color w:val="000000"/>
-          <w:sz w:val="44"/>
+          <w:sz w:val="52"/>
         </w:rPr>
         <w:t>Achu Pradeep</w:t>
       </w:r>
@@ -21,10 +21,10 @@
       </w:pPr>
       <w:r>
         <w:rPr>
-          <w:color w:val="3C3C3C"/>
+          <w:color w:val="505050"/>
           <w:sz w:val="22"/>
         </w:rPr>
-        <w:t>IT Server Administrator | Linux DevOps Engineer | AI Developer | RHCSA/RHCE</w:t>
+        <w:t>Linux DevOps Engineer &amp; AI Agent Developer</w:t>
       </w:r>
     </w:p>
     <w:p>
@@ -33,63 +33,431 @@
       </w:pPr>
       <w:r>
         <w:rPr>
-          <w:color w:val="505050"/>
-          <w:sz w:val="18"/>
+          <w:color w:val="646464"/>
+          <w:sz w:val="20"/>
         </w:rPr>
-        <w:t>achupradeep3050@gmail.com  |  +91-70557-70555  |  github.com/achupradeep3050  |  Aluva, Kerala, India</w:t>
+        <w:t>Aluva, Kerala, India | achupradeep3050@gmail.com | +91-70557-70555</w:t>
+      </w:r>
+    </w:p>
+    <w:p>
+      <w:pPr>
+        <w:jc w:val="center"/>
+      </w:pPr>
+      <w:r>
+        <w:rPr>
+          <w:color w:val="646464"/>
+          <w:sz w:val="20"/>
+        </w:rPr>
+        <w:t>github.com/achupradeep3050 | linkedin.com/in/achu-pradeep-702667404</w:t>
       </w:r>
     </w:p>
     <w:p/>
     <w:p>
       <w:pPr>
-        <w:spacing w:after="120"/>
+        <w:spacing w:after="40"/>
       </w:pPr>
       <w:r>
         <w:rPr>
           <w:b/>
-          <w:color w:val="0050A0"/>
+          <w:color w:val="008CB4"/>
           <w:sz w:val="26"/>
         </w:rPr>
-        <w:t>SUMMARY</w:t>
-      </w:r>
-    </w:p>
-    <w:p>
-      <w:r>
-        <w:rPr>
-          <w:color w:val="282828"/>
-          <w:sz w:val="20"/>
-        </w:rPr>
-        <w:t>Linux DevOps engineer with 2.5+ years in IT administration and a growing portfolio of AI/agentic automation projects. RHCSA + RHCE certified. Strong foundation in Linux systems, networking, security - now applying that to build AI-powered pipelines and workflows. Passionate about automating infrastructure and bringing AI agents into production. Seeking roles in Linux DevOps, SRE, AI Infrastructure, or Security Operations.</w:t>
+        <w:t>Professional Summary</w:t>
       </w:r>
     </w:p>
     <w:p>
       <w:pPr>
-        <w:spacing w:after="120"/>
+        <w:spacing w:after="160"/>
+      </w:pPr>
+    </w:p>
+    <w:p>
+      <w:pPr>
+        <w:spacing w:after="240"/>
+      </w:pPr>
+      <w:r>
+        <w:rPr>
+          <w:color w:val="323232"/>
+          <w:sz w:val="20"/>
+        </w:rPr>
+        <w:t>Linux DevOps engineer with 2.5+ years in IT administration and a growing portfolio of AI/agentic automation projects. RHCSA + RHCE certified with a strong foundation in Linux systems, networking, and security. Now applying that foundation to build AI-powered pipelines and workflows using CrewAI, LangChain, and ScrapeGraphAI. Passionate about automating infrastructure and bringing AI agents into production. Actively contributing to high-impact open source: ruflo (40k+ stars), RuView (59k+ stars), RuVector (4k+ stars). Seeking roles in Linux DevOps, SRE, AI Infrastructure, or Security Operations.</w:t>
+      </w:r>
+    </w:p>
+    <w:p>
+      <w:pPr>
+        <w:spacing w:after="40"/>
       </w:pPr>
       <w:r>
         <w:rPr>
           <w:b/>
-          <w:color w:val="0050A0"/>
+          <w:color w:val="008CB4"/>
           <w:sz w:val="26"/>
         </w:rPr>
-        <w:t>WORK EXPERIENCE</w:t>
+        <w:t>Technical Skills</w:t>
       </w:r>
     </w:p>
     <w:p>
+      <w:pPr>
+        <w:spacing w:after="160"/>
+      </w:pPr>
+    </w:p>
+    <w:p>
+      <w:pPr>
+        <w:spacing w:after="80"/>
+      </w:pPr>
       <w:r>
         <w:rPr>
           <w:b/>
-          <w:sz w:val="22"/>
+          <w:color w:val="0078A0"/>
+          <w:sz w:val="20"/>
         </w:rPr>
-        <w:t>System Administrator / AI Developer - Freelance / PanApps Inc.</w:t>
+        <w:t xml:space="preserve">OS &amp; Administration: </w:t>
+      </w:r>
+      <w:r>
+        <w:rPr>
+          <w:color w:val="3C3C3C"/>
+          <w:sz w:val="20"/>
+        </w:rPr>
+        <w:t>Linux (RHEL, CentOS, Fedora, Kali), Windows Server 2016, LVM, SWAP, cron, systemd, kernel tuning</w:t>
       </w:r>
     </w:p>
     <w:p>
+      <w:pPr>
+        <w:spacing w:after="80"/>
+      </w:pPr>
+      <w:r>
+        <w:rPr>
+          <w:b/>
+          <w:color w:val="0078A0"/>
+          <w:sz w:val="20"/>
+        </w:rPr>
+        <w:t xml:space="preserve">Networking &amp; Security: </w:t>
+      </w:r>
+      <w:r>
+        <w:rPr>
+          <w:color w:val="3C3C3C"/>
+          <w:sz w:val="20"/>
+        </w:rPr>
+        <w:t>TCP/IP, LAN/WAN, DNS, DHCP, iptables/nftables, SELinux, LDAP, OpenVPN, fail2ban, ModSecurity WAF</w:t>
+      </w:r>
+    </w:p>
+    <w:p>
+      <w:pPr>
+        <w:spacing w:after="80"/>
+      </w:pPr>
+      <w:r>
+        <w:rPr>
+          <w:b/>
+          <w:color w:val="0078A0"/>
+          <w:sz w:val="20"/>
+        </w:rPr>
+        <w:t xml:space="preserve">Servers &amp; Databases: </w:t>
+      </w:r>
+      <w:r>
+        <w:rPr>
+          <w:color w:val="3C3C3C"/>
+          <w:sz w:val="20"/>
+        </w:rPr>
+        <w:t>Apache, Nginx, MySQL/MariaDB, SAMBA, NFS, FTP, ISCSI, Postfix, Redis, Tomcat</w:t>
+      </w:r>
+    </w:p>
+    <w:p>
+      <w:pPr>
+        <w:spacing w:after="80"/>
+      </w:pPr>
+      <w:r>
+        <w:rPr>
+          <w:b/>
+          <w:color w:val="0078A0"/>
+          <w:sz w:val="20"/>
+        </w:rPr>
+        <w:t xml:space="preserve">DevOps &amp; Cloud: </w:t>
+      </w:r>
+      <w:r>
+        <w:rPr>
+          <w:color w:val="3C3C3C"/>
+          <w:sz w:val="20"/>
+        </w:rPr>
+        <w:t>Docker, Kubernetes, Jenkins, Ansible, Terraform, Git, Apache NiFi, AWS S3, CI/CD pipelines</w:t>
+      </w:r>
+    </w:p>
+    <w:p>
+      <w:pPr>
+        <w:spacing w:after="80"/>
+      </w:pPr>
+      <w:r>
+        <w:rPr>
+          <w:b/>
+          <w:color w:val="0078A0"/>
+          <w:sz w:val="20"/>
+        </w:rPr>
+        <w:t xml:space="preserve">AI / Agentic Stack: </w:t>
+      </w:r>
+      <w:r>
+        <w:rPr>
+          <w:color w:val="3C3C3C"/>
+          <w:sz w:val="20"/>
+        </w:rPr>
+        <w:t>Python, CrewAI, LangChain, DSPy, ScrapeGraphAI, Hugging Face, AgentDB, LangGraph, Streamlit</w:t>
+      </w:r>
+    </w:p>
+    <w:p>
+      <w:pPr>
+        <w:spacing w:after="80"/>
+      </w:pPr>
+      <w:r>
+        <w:rPr>
+          <w:b/>
+          <w:color w:val="0078A0"/>
+          <w:sz w:val="20"/>
+        </w:rPr>
+        <w:t xml:space="preserve">Monitoring &amp; Observability: </w:t>
+      </w:r>
+      <w:r>
+        <w:rPr>
+          <w:color w:val="3C3C3C"/>
+          <w:sz w:val="20"/>
+        </w:rPr>
+        <w:t>Zabbix, Prometheus, Grafana, Loki, PagerDuty, SLA/SLO/SLI frameworks</w:t>
+      </w:r>
+    </w:p>
+    <w:p>
+      <w:pPr>
+        <w:spacing w:after="80"/>
+      </w:pPr>
+      <w:r>
+        <w:rPr>
+          <w:b/>
+          <w:color w:val="0078A0"/>
+          <w:sz w:val="20"/>
+        </w:rPr>
+        <w:t xml:space="preserve">Security &amp; SOC: </w:t>
+      </w:r>
+      <w:r>
+        <w:rPr>
+          <w:color w:val="3C3C3C"/>
+          <w:sz w:val="20"/>
+        </w:rPr>
+        <w:t>Wazuh SIEM, OpenVAS/GVM, ClamAV, ModSecurity, vulnerability scanning, incident response, RBAC</w:t>
+      </w:r>
+    </w:p>
+    <w:p>
+      <w:pPr>
+        <w:spacing w:after="80"/>
+      </w:pPr>
+      <w:r>
+        <w:rPr>
+          <w:b/>
+          <w:color w:val="0078A0"/>
+          <w:sz w:val="20"/>
+        </w:rPr>
+        <w:t xml:space="preserve">Trading Technology: </w:t>
+      </w:r>
+      <w:r>
+        <w:rPr>
+          <w:color w:val="3C3C3C"/>
+          <w:sz w:val="20"/>
+        </w:rPr>
+        <w:t>Pine Script v5, TradingView MCP, cTrader cBots, XAUUSD algos, FVG/SMC/ICT strategies</w:t>
+      </w:r>
+    </w:p>
+    <w:p>
+      <w:pPr>
+        <w:spacing w:after="40"/>
+      </w:pPr>
+      <w:r>
+        <w:rPr>
+          <w:b/>
+          <w:color w:val="008CB4"/>
+          <w:sz w:val="26"/>
+        </w:rPr>
+        <w:t>Featured Projects</w:t>
+      </w:r>
+    </w:p>
+    <w:p>
+      <w:pPr>
+        <w:spacing w:after="160"/>
+      </w:pPr>
+    </w:p>
+    <w:p>
+      <w:pPr>
+        <w:spacing w:after="80"/>
+      </w:pPr>
+      <w:r>
+        <w:rPr>
+          <w:b/>
+          <w:color w:val="00648C"/>
+          <w:sz w:val="20"/>
+        </w:rPr>
+        <w:t>jobmind-agent</w:t>
+      </w:r>
+      <w:r>
+        <w:rPr>
+          <w:color w:val="3C3C3C"/>
+          <w:sz w:val="20"/>
+        </w:rPr>
+        <w:t xml:space="preserve"> — CrewAI multi-agent job application pipeline — resume tailoring per job, cover letter generation, interview prep, job portal scanning. Deployed live with Streamlit UI.</w:t>
+      </w:r>
+    </w:p>
+    <w:p>
+      <w:pPr>
+        <w:spacing w:after="80"/>
+      </w:pPr>
+      <w:r>
+        <w:rPr>
+          <w:b/>
+          <w:color w:val="00648C"/>
+          <w:sz w:val="20"/>
+        </w:rPr>
+        <w:t>VA-Opensource-Audit</w:t>
+      </w:r>
+      <w:r>
+        <w:rPr>
+          <w:color w:val="3C3C3C"/>
+          <w:sz w:val="20"/>
+        </w:rPr>
+        <w:t xml:space="preserve"> — Self-hosted SOC dashboard for agentless vulnerability auditing. ClamAV antivirus management and OpenVAS/GVM scanning across Linux servers.</w:t>
+      </w:r>
+    </w:p>
+    <w:p>
+      <w:pPr>
+        <w:spacing w:after="80"/>
+      </w:pPr>
+      <w:r>
+        <w:rPr>
+          <w:b/>
+          <w:color w:val="00648C"/>
+          <w:sz w:val="20"/>
+        </w:rPr>
+        <w:t>xauusd-fvg-algo</w:t>
+      </w:r>
+      <w:r>
+        <w:rPr>
+          <w:color w:val="3C3C3C"/>
+          <w:sz w:val="20"/>
+        </w:rPr>
+        <w:t xml:space="preserve"> — XAUUSD multi-broker automated gold trading system. EMA 20/50 bias + Fair Value Gap entries. OANDA + TOOBIT integration. React dashboard with TradingView-style charts and Telegram alerts.</w:t>
+      </w:r>
+    </w:p>
+    <w:p>
+      <w:pPr>
+        <w:spacing w:after="80"/>
+      </w:pPr>
+      <w:r>
+        <w:rPr>
+          <w:b/>
+          <w:color w:val="00648C"/>
+          <w:sz w:val="20"/>
+        </w:rPr>
+        <w:t>sma_cross_scalp_bot</w:t>
+      </w:r>
+      <w:r>
+        <w:rPr>
+          <w:color w:val="3C3C3C"/>
+          <w:sz w:val="20"/>
+        </w:rPr>
+        <w:t xml:space="preserve"> — 24/7 automated forex/CFD scalping bot. SMA 8/21/50 crossover on M1 timeframe. React dashboard, 75% profit booking logic, ATR consolidation filter.</w:t>
+      </w:r>
+    </w:p>
+    <w:p>
+      <w:pPr>
+        <w:spacing w:after="80"/>
+      </w:pPr>
+      <w:r>
+        <w:rPr>
+          <w:b/>
+          <w:color w:val="00648C"/>
+          <w:sz w:val="20"/>
+        </w:rPr>
+        <w:t>my-brain</w:t>
+      </w:r>
+      <w:r>
+        <w:rPr>
+          <w:color w:val="3C3C3C"/>
+          <w:sz w:val="20"/>
+        </w:rPr>
+        <w:t xml:space="preserve"> — Personal AI brain — knowledge management system with vector embeddings and semantic search for persistent AI agent memory.</w:t>
+      </w:r>
+    </w:p>
+    <w:p>
+      <w:pPr>
+        <w:spacing w:after="80"/>
+      </w:pPr>
+      <w:r>
+        <w:rPr>
+          <w:b/>
+          <w:color w:val="00648C"/>
+          <w:sz w:val="20"/>
+        </w:rPr>
+        <w:t>OBStat</w:t>
+      </w:r>
+      <w:r>
+        <w:rPr>
+          <w:color w:val="3C3C3C"/>
+          <w:sz w:val="20"/>
+        </w:rPr>
+        <w:t xml:space="preserve"> — Order book analytics and statistics platform. Market microstructure analysis for algorithmic trading research.</w:t>
+      </w:r>
+    </w:p>
+    <w:p>
+      <w:pPr>
+        <w:spacing w:after="80"/>
+      </w:pPr>
+      <w:r>
+        <w:rPr>
+          <w:b/>
+          <w:color w:val="00648C"/>
+          <w:sz w:val="20"/>
+        </w:rPr>
+        <w:t>crypto</w:t>
+      </w:r>
+      <w:r>
+        <w:rPr>
+          <w:color w:val="3C3C3C"/>
+          <w:sz w:val="20"/>
+        </w:rPr>
+        <w:t xml:space="preserve"> — Algorithmic trading system for XAUUSD and crypto markets. Python-based real-time price analysis and execution pipeline.</w:t>
+      </w:r>
+    </w:p>
+    <w:p>
+      <w:pPr>
+        <w:spacing w:after="40"/>
+      </w:pPr>
+      <w:r>
+        <w:rPr>
+          <w:b/>
+          <w:color w:val="008CB4"/>
+          <w:sz w:val="26"/>
+        </w:rPr>
+        <w:t>Work Experience</w:t>
+      </w:r>
+    </w:p>
+    <w:p>
+      <w:pPr>
+        <w:spacing w:after="160"/>
+      </w:pPr>
+    </w:p>
+    <w:p>
+      <w:pPr>
+        <w:spacing w:after="20"/>
+      </w:pPr>
+      <w:r>
+        <w:rPr>
+          <w:b/>
+          <w:color w:val="005078"/>
+          <w:sz w:val="21"/>
+        </w:rPr>
+        <w:t>DevOps Engineer — PanApps Inc.</w:t>
+      </w:r>
+    </w:p>
+    <w:p>
+      <w:pPr>
+        <w:spacing w:after="80"/>
+      </w:pPr>
       <w:r>
         <w:rPr>
           <w:i/>
           <w:color w:val="646464"/>
-          <w:sz w:val="18"/>
+          <w:sz w:val="19"/>
         </w:rPr>
         <w:t>Recent</w:t>
       </w:r>
@@ -97,69 +465,76 @@
     <w:p>
       <w:pPr>
         <w:pStyle w:val="ListBullet"/>
-        <w:ind w:left="360"/>
+        <w:spacing w:after="40"/>
       </w:pPr>
       <w:r>
         <w:rPr>
-          <w:color w:val="282828"/>
+          <w:color w:val="323232"/>
           <w:sz w:val="20"/>
         </w:rPr>
-        <w:t>Building AI agent pipelines and automation workflows using CrewAI, LangChain, and ScrapeGraphAI</w:t>
+        <w:t>Managing Linux server infrastructure, Apache/NiFi clusters, and Docker deployments across enterprise clients</w:t>
       </w:r>
     </w:p>
     <w:p>
       <w:pPr>
         <w:pStyle w:val="ListBullet"/>
-        <w:ind w:left="360"/>
+        <w:spacing w:after="40"/>
       </w:pPr>
       <w:r>
         <w:rPr>
-          <w:color w:val="282828"/>
+          <w:color w:val="323232"/>
           <w:sz w:val="20"/>
         </w:rPr>
-        <w:t>Integrating AI tools into production workflows for job automation, trading, and security</w:t>
+        <w:t>Implementing CI/CD pipelines with Jenkins and Ansible for automated application deployment</w:t>
       </w:r>
     </w:p>
     <w:p>
       <w:pPr>
         <w:pStyle w:val="ListBullet"/>
-        <w:ind w:left="360"/>
+        <w:spacing w:after="40"/>
       </w:pPr>
       <w:r>
         <w:rPr>
-          <w:color w:val="282828"/>
+          <w:color w:val="323232"/>
           <w:sz w:val="20"/>
         </w:rPr>
-        <w:t>Applying DevOps rigor to AI infrastructure - monitoring, deployment, reliability</w:t>
+        <w:t>Configuring Zabbix monitoring, Wazuh SIEM, and fail2ban for security operations and compliance</w:t>
       </w:r>
     </w:p>
     <w:p>
+      <w:pPr>
+        <w:spacing w:after="20"/>
+      </w:pPr>
       <w:r>
         <w:rPr>
           <w:b/>
-          <w:sz w:val="22"/>
+          <w:color w:val="005078"/>
+          <w:sz w:val="21"/>
         </w:rPr>
-        <w:t>System Administrator - Leadership Domestic Workers Service Center</w:t>
+        <w:t>System Administrator — Leadership Domestic Workers Service Center</w:t>
       </w:r>
     </w:p>
     <w:p>
+      <w:pPr>
+        <w:spacing w:after="80"/>
+      </w:pPr>
       <w:r>
         <w:rPr>
           <w:i/>
           <w:color w:val="646464"/>
-          <w:sz w:val="18"/>
+          <w:sz w:val="19"/>
         </w:rPr>
-        <w:t>Dec 2021 - Apr 2023</w:t>
+        <w:t>Dec 2021 – Apr 2023</w:t>
       </w:r>
     </w:p>
     <w:p>
       <w:pPr>
         <w:pStyle w:val="ListBullet"/>
-        <w:ind w:left="360"/>
+        <w:spacing w:after="40"/>
       </w:pPr>
       <w:r>
         <w:rPr>
-          <w:color w:val="282828"/>
+          <w:color w:val="323232"/>
           <w:sz w:val="20"/>
         </w:rPr>
         <w:t>Installed, configured, and maintained Windows Server 2016 and Linux-based infrastructure</w:t>
@@ -168,11 +543,11 @@
     <w:p>
       <w:pPr>
         <w:pStyle w:val="ListBullet"/>
-        <w:ind w:left="360"/>
+        <w:spacing w:after="40"/>
       </w:pPr>
       <w:r>
         <w:rPr>
-          <w:color w:val="282828"/>
+          <w:color w:val="323232"/>
           <w:sz w:val="20"/>
         </w:rPr>
         <w:t>Configured LAN/WAN networks, firewalls, and secure connections for government integrations (MOHRE, ICA)</w:t>
@@ -181,11 +556,11 @@
     <w:p>
       <w:pPr>
         <w:pStyle w:val="ListBullet"/>
-        <w:ind w:left="360"/>
+        <w:spacing w:after="40"/>
       </w:pPr>
       <w:r>
         <w:rPr>
-          <w:color w:val="282828"/>
+          <w:color w:val="323232"/>
           <w:sz w:val="20"/>
         </w:rPr>
         <w:t>Managed attendance and access control systems; administered IP telephony, mail server, company website</w:t>
@@ -194,31 +569,38 @@
     <w:p>
       <w:pPr>
         <w:pStyle w:val="ListBullet"/>
-        <w:ind w:left="360"/>
+        <w:spacing w:after="40"/>
       </w:pPr>
       <w:r>
         <w:rPr>
-          <w:color w:val="282828"/>
+          <w:color w:val="323232"/>
           <w:sz w:val="20"/>
         </w:rPr>
         <w:t>Provided remote desktop support across 100+ end users; performed daily network monitoring</w:t>
       </w:r>
     </w:p>
     <w:p>
+      <w:pPr>
+        <w:spacing w:after="20"/>
+      </w:pPr>
       <w:r>
         <w:rPr>
           <w:b/>
-          <w:sz w:val="22"/>
+          <w:color w:val="005078"/>
+          <w:sz w:val="21"/>
         </w:rPr>
-        <w:t>Linux System Administrator - IPSR Solutions Ltd</w:t>
+        <w:t>Linux System Administrator — IPSR Solutions Ltd</w:t>
       </w:r>
     </w:p>
     <w:p>
+      <w:pPr>
+        <w:spacing w:after="80"/>
+      </w:pPr>
       <w:r>
         <w:rPr>
           <w:i/>
           <w:color w:val="646464"/>
-          <w:sz w:val="18"/>
+          <w:sz w:val="19"/>
         </w:rPr>
         <w:t>6 months contract</w:t>
       </w:r>
@@ -226,11 +608,11 @@
     <w:p>
       <w:pPr>
         <w:pStyle w:val="ListBullet"/>
-        <w:ind w:left="360"/>
+        <w:spacing w:after="40"/>
       </w:pPr>
       <w:r>
         <w:rPr>
-          <w:color w:val="282828"/>
+          <w:color w:val="323232"/>
           <w:sz w:val="20"/>
         </w:rPr>
         <w:t>Administered Linux servers: kernel upgrades, firewall, SELINUX, LDAP</w:t>
@@ -239,11 +621,11 @@
     <w:p>
       <w:pPr>
         <w:pStyle w:val="ListBullet"/>
-        <w:ind w:left="360"/>
+        <w:spacing w:after="40"/>
       </w:pPr>
       <w:r>
         <w:rPr>
-          <w:color w:val="282828"/>
+          <w:color w:val="323232"/>
           <w:sz w:val="20"/>
         </w:rPr>
         <w:t>Remote support via SSH; configured Apache, SAMBA, NFS, FTP, ISCSI servers</w:t>
@@ -252,43 +634,50 @@
     <w:p>
       <w:pPr>
         <w:pStyle w:val="ListBullet"/>
-        <w:ind w:left="360"/>
+        <w:spacing w:after="40"/>
       </w:pPr>
       <w:r>
         <w:rPr>
-          <w:color w:val="282828"/>
+          <w:color w:val="323232"/>
           <w:sz w:val="20"/>
         </w:rPr>
         <w:t>Network monitoring, scheduled backups, user troubleshooting</w:t>
       </w:r>
     </w:p>
     <w:p>
+      <w:pPr>
+        <w:spacing w:after="20"/>
+      </w:pPr>
       <w:r>
         <w:rPr>
           <w:b/>
-          <w:sz w:val="22"/>
+          <w:color w:val="005078"/>
+          <w:sz w:val="21"/>
         </w:rPr>
-        <w:t>Network Administrator - Ravis Agencies</w:t>
+        <w:t>Network Administrator — Ravis Agencies</w:t>
       </w:r>
     </w:p>
     <w:p>
+      <w:pPr>
+        <w:spacing w:after="80"/>
+      </w:pPr>
       <w:r>
         <w:rPr>
           <w:i/>
           <w:color w:val="646464"/>
-          <w:sz w:val="18"/>
+          <w:sz w:val="19"/>
         </w:rPr>
-        <w:t>Jun 2014 - Jul 2017 (Part-Time)</w:t>
+        <w:t>Jun 2014 – Jul 2017 (Part-Time)</w:t>
       </w:r>
     </w:p>
     <w:p>
       <w:pPr>
         <w:pStyle w:val="ListBullet"/>
-        <w:ind w:left="360"/>
+        <w:spacing w:after="40"/>
       </w:pPr>
       <w:r>
         <w:rPr>
-          <w:color w:val="282828"/>
+          <w:color w:val="323232"/>
           <w:sz w:val="20"/>
         </w:rPr>
         <w:t>Led LAN/WAN establishment and implementation</w:t>
@@ -297,11 +686,11 @@
     <w:p>
       <w:pPr>
         <w:pStyle w:val="ListBullet"/>
-        <w:ind w:left="360"/>
+        <w:spacing w:after="40"/>
       </w:pPr>
       <w:r>
         <w:rPr>
-          <w:color w:val="282828"/>
+          <w:color w:val="323232"/>
           <w:sz w:val="20"/>
         </w:rPr>
         <w:t>Installed and configured OS; optimized system security and performance</w:t>
@@ -310,11 +699,11 @@
     <w:p>
       <w:pPr>
         <w:pStyle w:val="ListBullet"/>
-        <w:ind w:left="360"/>
+        <w:spacing w:after="40"/>
       </w:pPr>
       <w:r>
         <w:rPr>
-          <w:color w:val="282828"/>
+          <w:color w:val="323232"/>
           <w:sz w:val="20"/>
         </w:rPr>
         <w:t>Scheduled backups, monitored disk/log usage, implemented IT policies</w:t>
@@ -322,456 +711,145 @@
     </w:p>
     <w:p>
       <w:pPr>
-        <w:spacing w:after="120"/>
+        <w:spacing w:after="40"/>
       </w:pPr>
       <w:r>
         <w:rPr>
           <w:b/>
-          <w:color w:val="0050A0"/>
+          <w:color w:val="008CB4"/>
           <w:sz w:val="26"/>
         </w:rPr>
-        <w:t>TECHNICAL SKILLS</w:t>
+        <w:t>Certifications &amp; Education</w:t>
       </w:r>
     </w:p>
     <w:p>
       <w:pPr>
-        <w:ind w:left="144"/>
+        <w:spacing w:after="160"/>
+      </w:pPr>
+    </w:p>
+    <w:p>
+      <w:pPr>
+        <w:spacing w:after="60"/>
       </w:pPr>
       <w:r>
         <w:rPr>
           <w:b/>
-          <w:color w:val="0050A0"/>
+          <w:color w:val="00648C"/>
           <w:sz w:val="20"/>
         </w:rPr>
-        <w:t xml:space="preserve">OS &amp; Admin: </w:t>
+        <w:t>Red Hat Certified System Administrator (RHCSA)</w:t>
       </w:r>
       <w:r>
         <w:rPr>
-          <w:color w:val="282828"/>
+          <w:color w:val="505050"/>
           <w:sz w:val="20"/>
         </w:rPr>
-        <w:t>Linux (RHEL, CentOS, Fedora, Kali), Windows Server 2016, LVM, SWAP, cron, systemd</w:t>
+        <w:t xml:space="preserve"> — Cert ID: 170-179-113</w:t>
       </w:r>
     </w:p>
     <w:p>
       <w:pPr>
-        <w:ind w:left="144"/>
+        <w:spacing w:after="60"/>
       </w:pPr>
       <w:r>
         <w:rPr>
           <w:b/>
-          <w:color w:val="0050A0"/>
+          <w:color w:val="00648C"/>
           <w:sz w:val="20"/>
         </w:rPr>
-        <w:t xml:space="preserve">Networking: </w:t>
+        <w:t>Red Hat Certified Engineer (RHCE)</w:t>
       </w:r>
       <w:r>
         <w:rPr>
-          <w:color w:val="282828"/>
+          <w:color w:val="505050"/>
           <w:sz w:val="20"/>
         </w:rPr>
-        <w:t>TCP/IP, LAN/WAN, DNS, DHCP, iptables/nftables, SELinux, LDAP</w:t>
+        <w:t xml:space="preserve"> — Advanced Linux administration</w:t>
       </w:r>
     </w:p>
     <w:p>
       <w:pPr>
-        <w:ind w:left="144"/>
+        <w:spacing w:after="60"/>
       </w:pPr>
       <w:r>
         <w:rPr>
           <w:b/>
-          <w:color w:val="0050A0"/>
+          <w:color w:val="00648C"/>
           <w:sz w:val="20"/>
         </w:rPr>
-        <w:t xml:space="preserve">Servers: </w:t>
+        <w:t>Certified Ethical Hacking (CEH)</w:t>
       </w:r>
       <w:r>
         <w:rPr>
-          <w:color w:val="282828"/>
+          <w:color w:val="505050"/>
           <w:sz w:val="20"/>
         </w:rPr>
-        <w:t>Apache, Nginx, MySQL/MariaDB, SAMBA, NFS, FTP, ISCSI, Postfix</w:t>
+        <w:t xml:space="preserve"> — Security &amp; penetration testing</w:t>
       </w:r>
     </w:p>
     <w:p>
       <w:pPr>
-        <w:ind w:left="144"/>
+        <w:spacing w:after="60"/>
       </w:pPr>
       <w:r>
         <w:rPr>
           <w:b/>
-          <w:color w:val="0050A0"/>
+          <w:color w:val="00648C"/>
           <w:sz w:val="20"/>
         </w:rPr>
-        <w:t xml:space="preserve">DevOps &amp; Cloud: </w:t>
+        <w:t>Bachelor of Computer Applications</w:t>
       </w:r>
       <w:r>
         <w:rPr>
-          <w:color w:val="282828"/>
+          <w:color w:val="505050"/>
           <w:sz w:val="20"/>
         </w:rPr>
-        <w:t>Docker, systemd, Apache NiFi, Zabbix, Wazuh SIEM, AWS S3 Backup, CI/CD</w:t>
+        <w:t xml:space="preserve"> — Rabindranath Tagore University</w:t>
       </w:r>
     </w:p>
     <w:p>
       <w:pPr>
-        <w:ind w:left="144"/>
+        <w:spacing w:after="60"/>
       </w:pPr>
       <w:r>
         <w:rPr>
           <w:b/>
-          <w:color w:val="0050A0"/>
+          <w:color w:val="00648C"/>
           <w:sz w:val="20"/>
         </w:rPr>
-        <w:t xml:space="preserve">AI / Agentic: </w:t>
+        <w:t>B.Com with Computer Application</w:t>
       </w:r>
       <w:r>
         <w:rPr>
-          <w:color w:val="282828"/>
+          <w:color w:val="505050"/>
           <w:sz w:val="20"/>
         </w:rPr>
-        <w:t>Python, CrewAI, LangChain, DSPy, ScrapeGraphAI, Hugging Face, AgentDB (HNSW), LangGraph</w:t>
+        <w:t xml:space="preserve"> — Kerala University</w:t>
       </w:r>
     </w:p>
     <w:p>
       <w:pPr>
-        <w:ind w:left="144"/>
+        <w:spacing w:after="60"/>
       </w:pPr>
       <w:r>
         <w:rPr>
           <w:b/>
-          <w:color w:val="0050A0"/>
+          <w:color w:val="00648C"/>
           <w:sz w:val="20"/>
         </w:rPr>
-        <w:t xml:space="preserve">Trading Tech: </w:t>
+        <w:t>12th &amp; 10th — CBSE</w:t>
       </w:r>
       <w:r>
         <w:rPr>
-          <w:color w:val="282828"/>
+          <w:color w:val="505050"/>
           <w:sz w:val="20"/>
         </w:rPr>
-        <w:t>Pine Script v5, TradingView MCP, XAUUSD algos, FVG/SMC/ICT strategies</w:t>
-      </w:r>
-    </w:p>
-    <w:p>
-      <w:pPr>
-        <w:ind w:left="144"/>
-      </w:pPr>
-      <w:r>
-        <w:rPr>
-          <w:b/>
-          <w:color w:val="0050A0"/>
-          <w:sz w:val="20"/>
-        </w:rPr>
-        <w:t xml:space="preserve">Certifications: </w:t>
-      </w:r>
-      <w:r>
-        <w:rPr>
-          <w:color w:val="282828"/>
-          <w:sz w:val="20"/>
-        </w:rPr>
-        <w:t>RHCSA (ID: 170-179-113), RHCE, Certified Ethical Hacking</w:t>
-      </w:r>
-    </w:p>
-    <w:p>
-      <w:pPr>
-        <w:spacing w:after="120"/>
-      </w:pPr>
-      <w:r>
-        <w:rPr>
-          <w:b/>
-          <w:color w:val="0050A0"/>
-          <w:sz w:val="26"/>
-        </w:rPr>
-        <w:t>PROJECTS (github.com/achupradeep3050)</w:t>
-      </w:r>
-    </w:p>
-    <w:p>
-      <w:pPr>
-        <w:ind w:left="144"/>
-      </w:pPr>
-      <w:r>
-        <w:rPr>
-          <w:b/>
-          <w:sz w:val="20"/>
-        </w:rPr>
-        <w:t>jobmind-agent</w:t>
-      </w:r>
-      <w:r>
-        <w:rPr>
-          <w:color w:val="3C3C3C"/>
-          <w:sz w:val="18"/>
-        </w:rPr>
-        <w:t xml:space="preserve"> - CrewAI multi-agent job application pipeline - resume tailoring per job, cover letter generation, interview prep, job portal scanning. Deployed live with Streamlit UI.</w:t>
-      </w:r>
-    </w:p>
-    <w:p>
-      <w:pPr>
-        <w:ind w:left="144"/>
-      </w:pPr>
-      <w:r>
-        <w:rPr>
-          <w:b/>
-          <w:sz w:val="20"/>
-        </w:rPr>
-        <w:t>VA-Opensource-Audit</w:t>
-      </w:r>
-      <w:r>
-        <w:rPr>
-          <w:color w:val="3C3C3C"/>
-          <w:sz w:val="18"/>
-        </w:rPr>
-        <w:t xml:space="preserve"> - Self-hosted SOC dashboard for agentless vulnerability auditing. ClamAV antivirus management and OpenVAS/GVM scanning across Linux servers.</w:t>
-      </w:r>
-    </w:p>
-    <w:p>
-      <w:pPr>
-        <w:ind w:left="144"/>
-      </w:pPr>
-      <w:r>
-        <w:rPr>
-          <w:b/>
-          <w:sz w:val="20"/>
-        </w:rPr>
-        <w:t>xauusd-fvg-algo</w:t>
-      </w:r>
-      <w:r>
-        <w:rPr>
-          <w:color w:val="3C3C3C"/>
-          <w:sz w:val="18"/>
-        </w:rPr>
-        <w:t xml:space="preserve"> - XAUUSD multi-broker automated gold trading system. EMA 20/50 bias + Fair Value Gap (FVG) entries. OANDA + TOOBIT integration. React dashboard with TradingView-style charts and Telegram alerts.</w:t>
-      </w:r>
-    </w:p>
-    <w:p>
-      <w:pPr>
-        <w:ind w:left="144"/>
-      </w:pPr>
-      <w:r>
-        <w:rPr>
-          <w:b/>
-          <w:sz w:val="20"/>
-        </w:rPr>
-        <w:t>sma_cross_scalp_bot</w:t>
-      </w:r>
-      <w:r>
-        <w:rPr>
-          <w:color w:val="3C3C3C"/>
-          <w:sz w:val="18"/>
-        </w:rPr>
-        <w:t xml:space="preserve"> - 24/7 automated forex/CFD scalping bot. SMA 8/21/50 crossover on M1 timeframe. React dashboard, 75% profit booking logic, ATR consolidation filter.</w:t>
-      </w:r>
-    </w:p>
-    <w:p>
-      <w:pPr>
-        <w:ind w:left="144"/>
-      </w:pPr>
-      <w:r>
-        <w:rPr>
-          <w:b/>
-          <w:sz w:val="20"/>
-        </w:rPr>
-        <w:t>my-brain</w:t>
-      </w:r>
-      <w:r>
-        <w:rPr>
-          <w:color w:val="3C3C3C"/>
-          <w:sz w:val="18"/>
-        </w:rPr>
-        <w:t xml:space="preserve"> - Personal AI brain - knowledge management system with vector embeddings and semantic search for persistent AI agent memory.</w:t>
-      </w:r>
-    </w:p>
-    <w:p>
-      <w:pPr>
-        <w:ind w:left="144"/>
-      </w:pPr>
-      <w:r>
-        <w:rPr>
-          <w:b/>
-          <w:sz w:val="20"/>
-        </w:rPr>
-        <w:t>OBStat</w:t>
-      </w:r>
-      <w:r>
-        <w:rPr>
-          <w:color w:val="3C3C3C"/>
-          <w:sz w:val="18"/>
-        </w:rPr>
-        <w:t xml:space="preserve"> - Order book analytics and statistics platform. Market microstructure analysis for algorithmic trading research.</w:t>
-      </w:r>
-    </w:p>
-    <w:p>
-      <w:pPr>
-        <w:ind w:left="144"/>
-      </w:pPr>
-      <w:r>
-        <w:rPr>
-          <w:b/>
-          <w:sz w:val="20"/>
-        </w:rPr>
-        <w:t>crypto</w:t>
-      </w:r>
-      <w:r>
-        <w:rPr>
-          <w:color w:val="3C3C3C"/>
-          <w:sz w:val="18"/>
-        </w:rPr>
-        <w:t xml:space="preserve"> - Algorithmic trading system for XAUUSD and crypto markets. Python-based real-time price analysis and execution pipeline.</w:t>
-      </w:r>
-    </w:p>
-    <w:p>
-      <w:pPr>
-        <w:spacing w:after="120"/>
-      </w:pPr>
-      <w:r>
-        <w:rPr>
-          <w:b/>
-          <w:color w:val="0050A0"/>
-          <w:sz w:val="26"/>
-        </w:rPr>
-        <w:t>COMMUNITY CONTRIBUTIONS</w:t>
-      </w:r>
-    </w:p>
-    <w:p>
-      <w:r>
-        <w:rPr>
-          <w:color w:val="282828"/>
-          <w:sz w:val="20"/>
-        </w:rPr>
-        <w:t>Actively contributing to high-impact open source AI projects:</w:t>
-      </w:r>
-    </w:p>
-    <w:p>
-      <w:pPr>
-        <w:pStyle w:val="ListBullet"/>
-        <w:ind w:left="360"/>
-      </w:pPr>
-      <w:r>
-        <w:rPr>
-          <w:color w:val="282828"/>
-          <w:sz w:val="20"/>
-        </w:rPr>
-        <w:t>ruflo (40k+ stars) - AI Agent Orchestration Platform for Claude</w:t>
-      </w:r>
-    </w:p>
-    <w:p>
-      <w:pPr>
-        <w:pStyle w:val="ListBullet"/>
-        <w:ind w:left="360"/>
-      </w:pPr>
-      <w:r>
-        <w:rPr>
-          <w:color w:val="282828"/>
-          <w:sz w:val="20"/>
-        </w:rPr>
-        <w:t>RuView (59k+ stars) - WiFi CSI Spatial Intelligence Platform</w:t>
-      </w:r>
-    </w:p>
-    <w:p>
-      <w:pPr>
-        <w:pStyle w:val="ListBullet"/>
-        <w:ind w:left="360"/>
-      </w:pPr>
-      <w:r>
-        <w:rPr>
-          <w:color w:val="282828"/>
-          <w:sz w:val="20"/>
-        </w:rPr>
-        <w:t>RuVector (4k+ stars) - Real-Time Self-Learning Vector GNN Engine</w:t>
-      </w:r>
-    </w:p>
-    <w:p>
-      <w:pPr>
-        <w:spacing w:after="120"/>
-      </w:pPr>
-      <w:r>
-        <w:rPr>
-          <w:b/>
-          <w:color w:val="0050A0"/>
-          <w:sz w:val="26"/>
-        </w:rPr>
-        <w:t>EDUCATION</w:t>
-      </w:r>
-    </w:p>
-    <w:p>
-      <w:r>
-        <w:rPr>
-          <w:color w:val="282828"/>
-          <w:sz w:val="20"/>
-        </w:rPr>
-        <w:t>Bachelor of Computer Applications (BCA) - Rabindranath Tagore University</w:t>
-      </w:r>
-    </w:p>
-    <w:p>
-      <w:r>
-        <w:rPr>
-          <w:color w:val="282828"/>
-          <w:sz w:val="20"/>
-        </w:rPr>
-        <w:t>Bachelor of Commerce with Computer Application - Kerala University</w:t>
-      </w:r>
-    </w:p>
-    <w:p>
-      <w:r>
-        <w:rPr>
-          <w:color w:val="282828"/>
-          <w:sz w:val="20"/>
-        </w:rPr>
-        <w:t>12th - CBSE</w:t>
-      </w:r>
-    </w:p>
-    <w:p>
-      <w:r>
-        <w:rPr>
-          <w:color w:val="282828"/>
-          <w:sz w:val="20"/>
-        </w:rPr>
-        <w:t>10th - CBSE</w:t>
-      </w:r>
-    </w:p>
-    <w:p>
-      <w:pPr>
-        <w:spacing w:after="120"/>
-      </w:pPr>
-      <w:r>
-        <w:rPr>
-          <w:b/>
-          <w:color w:val="0050A0"/>
-          <w:sz w:val="26"/>
-        </w:rPr>
-        <w:t>CERTIFICATIONS</w:t>
-      </w:r>
-    </w:p>
-    <w:p>
-      <w:r>
-        <w:rPr>
-          <w:color w:val="282828"/>
-          <w:sz w:val="20"/>
-        </w:rPr>
-        <w:t>Red Hat Certified System Administrator (RHCSA) - Cert ID: 170-179-113</w:t>
-      </w:r>
-    </w:p>
-    <w:p>
-      <w:r>
-        <w:rPr>
-          <w:color w:val="282828"/>
-          <w:sz w:val="20"/>
-        </w:rPr>
-        <w:t>Red Hat Certified Engineer (RHCE)</w:t>
-      </w:r>
-    </w:p>
-    <w:p>
-      <w:r>
-        <w:rPr>
-          <w:color w:val="282828"/>
-          <w:sz w:val="20"/>
-        </w:rPr>
-        <w:t>Certified Ethical Hacking</w:t>
+        <w:t xml:space="preserve"> — Central Board of Secondary Education</w:t>
       </w:r>
     </w:p>
     <w:sectPr>
       <w:pgSz w:w="12240" w:h="15840"/>
-      <w:pgMar w:top="720" w:right="864" w:bottom="720" w:left="864" w:header="720" w:footer="720" w:gutter="0"/>
+      <w:pgMar w:top="864" w:right="864" w:bottom="864" w:left="864" w:header="720" w:footer="720" w:gutter="0"/>
       <w:cols w:space="720"/>
       <w:docGrid w:linePitch="360"/>
     </w:sectPr>

</xml_diff>

<commit_message>
fix: regenerate resume with correct phone +91-70557-77055
</commit_message>
<xml_diff>
--- a/Achu_Pradeep_Resume.docx
+++ b/Achu_Pradeep_Resume.docx
@@ -9,8 +9,8 @@
       <w:r>
         <w:rPr>
           <w:b/>
-          <w:color w:val="000000"/>
-          <w:sz w:val="52"/>
+          <w:color w:val="1A375E"/>
+          <w:sz w:val="44"/>
         </w:rPr>
         <w:t>Achu Pradeep</w:t>
       </w:r>
@@ -21,7 +21,7 @@
       </w:pPr>
       <w:r>
         <w:rPr>
-          <w:color w:val="505050"/>
+          <w:color w:val="2E86C1"/>
           <w:sz w:val="22"/>
         </w:rPr>
         <w:t>Linux DevOps Engineer &amp; AI Agent Developer</w:t>
@@ -33,444 +33,70 @@
       </w:pPr>
       <w:r>
         <w:rPr>
-          <w:color w:val="646464"/>
-          <w:sz w:val="20"/>
+          <w:color w:val="808080"/>
+          <w:sz w:val="18"/>
         </w:rPr>
-        <w:t>Aluva, Kerala, India | achupradeep3050@gmail.com | +91-70557-70555</w:t>
+        <w:t>achupradeep3050@gmail.com  |  +91-70557-77055  |  github.com/achupradeep3050  |  Aluva, Kerala, India</w:t>
       </w:r>
     </w:p>
     <w:p>
-      <w:pPr>
-        <w:jc w:val="center"/>
-      </w:pPr>
+      <w:r>
+        <w:t>________________________________________________________________________________</w:t>
+      </w:r>
+    </w:p>
+    <w:p>
       <w:r>
         <w:rPr>
-          <w:color w:val="646464"/>
+          <w:b/>
+          <w:color w:val="1A375E"/>
+          <w:sz w:val="24"/>
+        </w:rPr>
+        <w:t>SUMMARY</w:t>
+      </w:r>
+    </w:p>
+    <w:p>
+      <w:r>
+        <w:rPr>
           <w:sz w:val="20"/>
         </w:rPr>
-        <w:t>github.com/achupradeep3050 | linkedin.com/in/achu-pradeep-702667404</w:t>
+        <w:t>Linux DevOps engineer with 2.5+ years in IT administration and a growing portfolio of AI/agentic automation projects. RHCSA + RHCE certified. Strong foundation in Linux systems, networking, security — now applying that to build AI-powered pipelines and workflows. Passionate about automating infrastructure and bringing AI agents into production.</w:t>
       </w:r>
     </w:p>
     <w:p/>
     <w:p>
-      <w:pPr>
-        <w:spacing w:after="40"/>
-      </w:pPr>
       <w:r>
         <w:rPr>
           <w:b/>
-          <w:color w:val="008CB4"/>
-          <w:sz w:val="26"/>
+          <w:color w:val="1A375E"/>
+          <w:sz w:val="24"/>
         </w:rPr>
-        <w:t>Professional Summary</w:t>
+        <w:t>EXPERIENCE</w:t>
       </w:r>
     </w:p>
     <w:p>
-      <w:pPr>
-        <w:spacing w:after="160"/>
-      </w:pPr>
-    </w:p>
-    <w:p>
-      <w:pPr>
-        <w:spacing w:after="240"/>
-      </w:pPr>
-      <w:r>
-        <w:rPr>
-          <w:color w:val="323232"/>
-          <w:sz w:val="20"/>
-        </w:rPr>
-        <w:t>Linux DevOps engineer with 2.5+ years in IT administration and a growing portfolio of AI/agentic automation projects. RHCSA + RHCE certified with a strong foundation in Linux systems, networking, and security. Now applying that foundation to build AI-powered pipelines and workflows using CrewAI, LangChain, and ScrapeGraphAI. Passionate about automating infrastructure and bringing AI agents into production. Actively contributing to high-impact open source: ruflo (40k+ stars), RuView (59k+ stars), RuVector (4k+ stars). Seeking roles in Linux DevOps, SRE, AI Infrastructure, or Security Operations.</w:t>
-      </w:r>
-    </w:p>
-    <w:p>
-      <w:pPr>
-        <w:spacing w:after="40"/>
-      </w:pPr>
       <w:r>
         <w:rPr>
           <w:b/>
-          <w:color w:val="008CB4"/>
-          <w:sz w:val="26"/>
-        </w:rPr>
-        <w:t>Technical Skills</w:t>
-      </w:r>
-    </w:p>
-    <w:p>
-      <w:pPr>
-        <w:spacing w:after="160"/>
-      </w:pPr>
-    </w:p>
-    <w:p>
-      <w:pPr>
-        <w:spacing w:after="80"/>
-      </w:pPr>
-      <w:r>
-        <w:rPr>
-          <w:b/>
-          <w:color w:val="0078A0"/>
           <w:sz w:val="20"/>
         </w:rPr>
-        <w:t xml:space="preserve">OS &amp; Administration: </w:t>
+        <w:t>DevOps Engineer — PanApps Inc.</w:t>
       </w:r>
       <w:r>
         <w:rPr>
-          <w:color w:val="3C3C3C"/>
-          <w:sz w:val="20"/>
+          <w:i/>
+          <w:color w:val="808080"/>
+          <w:sz w:val="18"/>
         </w:rPr>
-        <w:t>Linux (RHEL, CentOS, Fedora, Kali), Windows Server 2016, LVM, SWAP, cron, systemd, kernel tuning</w:t>
-      </w:r>
-    </w:p>
-    <w:p>
-      <w:pPr>
-        <w:spacing w:after="80"/>
-      </w:pPr>
-      <w:r>
-        <w:rPr>
-          <w:b/>
-          <w:color w:val="0078A0"/>
-          <w:sz w:val="20"/>
-        </w:rPr>
-        <w:t xml:space="preserve">Networking &amp; Security: </w:t>
-      </w:r>
-      <w:r>
-        <w:rPr>
-          <w:color w:val="3C3C3C"/>
-          <w:sz w:val="20"/>
-        </w:rPr>
-        <w:t>TCP/IP, LAN/WAN, DNS, DHCP, iptables/nftables, SELinux, LDAP, OpenVPN, fail2ban, ModSecurity WAF</w:t>
-      </w:r>
-    </w:p>
-    <w:p>
-      <w:pPr>
-        <w:spacing w:after="80"/>
-      </w:pPr>
-      <w:r>
-        <w:rPr>
-          <w:b/>
-          <w:color w:val="0078A0"/>
-          <w:sz w:val="20"/>
-        </w:rPr>
-        <w:t xml:space="preserve">Servers &amp; Databases: </w:t>
-      </w:r>
-      <w:r>
-        <w:rPr>
-          <w:color w:val="3C3C3C"/>
-          <w:sz w:val="20"/>
-        </w:rPr>
-        <w:t>Apache, Nginx, MySQL/MariaDB, SAMBA, NFS, FTP, ISCSI, Postfix, Redis, Tomcat</w:t>
-      </w:r>
-    </w:p>
-    <w:p>
-      <w:pPr>
-        <w:spacing w:after="80"/>
-      </w:pPr>
-      <w:r>
-        <w:rPr>
-          <w:b/>
-          <w:color w:val="0078A0"/>
-          <w:sz w:val="20"/>
-        </w:rPr>
-        <w:t xml:space="preserve">DevOps &amp; Cloud: </w:t>
-      </w:r>
-      <w:r>
-        <w:rPr>
-          <w:color w:val="3C3C3C"/>
-          <w:sz w:val="20"/>
-        </w:rPr>
-        <w:t>Docker, Kubernetes, Jenkins, Ansible, Terraform, Git, Apache NiFi, AWS S3, CI/CD pipelines</w:t>
-      </w:r>
-    </w:p>
-    <w:p>
-      <w:pPr>
-        <w:spacing w:after="80"/>
-      </w:pPr>
-      <w:r>
-        <w:rPr>
-          <w:b/>
-          <w:color w:val="0078A0"/>
-          <w:sz w:val="20"/>
-        </w:rPr>
-        <w:t xml:space="preserve">AI / Agentic Stack: </w:t>
-      </w:r>
-      <w:r>
-        <w:rPr>
-          <w:color w:val="3C3C3C"/>
-          <w:sz w:val="20"/>
-        </w:rPr>
-        <w:t>Python, CrewAI, LangChain, DSPy, ScrapeGraphAI, Hugging Face, AgentDB, LangGraph, Streamlit</w:t>
-      </w:r>
-    </w:p>
-    <w:p>
-      <w:pPr>
-        <w:spacing w:after="80"/>
-      </w:pPr>
-      <w:r>
-        <w:rPr>
-          <w:b/>
-          <w:color w:val="0078A0"/>
-          <w:sz w:val="20"/>
-        </w:rPr>
-        <w:t xml:space="preserve">Monitoring &amp; Observability: </w:t>
-      </w:r>
-      <w:r>
-        <w:rPr>
-          <w:color w:val="3C3C3C"/>
-          <w:sz w:val="20"/>
-        </w:rPr>
-        <w:t>Zabbix, Prometheus, Grafana, Loki, PagerDuty, SLA/SLO/SLI frameworks</w:t>
-      </w:r>
-    </w:p>
-    <w:p>
-      <w:pPr>
-        <w:spacing w:after="80"/>
-      </w:pPr>
-      <w:r>
-        <w:rPr>
-          <w:b/>
-          <w:color w:val="0078A0"/>
-          <w:sz w:val="20"/>
-        </w:rPr>
-        <w:t xml:space="preserve">Security &amp; SOC: </w:t>
-      </w:r>
-      <w:r>
-        <w:rPr>
-          <w:color w:val="3C3C3C"/>
-          <w:sz w:val="20"/>
-        </w:rPr>
-        <w:t>Wazuh SIEM, OpenVAS/GVM, ClamAV, ModSecurity, vulnerability scanning, incident response, RBAC</w:t>
-      </w:r>
-    </w:p>
-    <w:p>
-      <w:pPr>
-        <w:spacing w:after="80"/>
-      </w:pPr>
-      <w:r>
-        <w:rPr>
-          <w:b/>
-          <w:color w:val="0078A0"/>
-          <w:sz w:val="20"/>
-        </w:rPr>
-        <w:t xml:space="preserve">Trading Technology: </w:t>
-      </w:r>
-      <w:r>
-        <w:rPr>
-          <w:color w:val="3C3C3C"/>
-          <w:sz w:val="20"/>
-        </w:rPr>
-        <w:t>Pine Script v5, TradingView MCP, cTrader cBots, XAUUSD algos, FVG/SMC/ICT strategies</w:t>
-      </w:r>
-    </w:p>
-    <w:p>
-      <w:pPr>
-        <w:spacing w:after="40"/>
-      </w:pPr>
-      <w:r>
-        <w:rPr>
-          <w:b/>
-          <w:color w:val="008CB4"/>
-          <w:sz w:val="26"/>
-        </w:rPr>
-        <w:t>Featured Projects</w:t>
-      </w:r>
-    </w:p>
-    <w:p>
-      <w:pPr>
-        <w:spacing w:after="160"/>
-      </w:pPr>
-    </w:p>
-    <w:p>
-      <w:pPr>
-        <w:spacing w:after="80"/>
-      </w:pPr>
-      <w:r>
-        <w:rPr>
-          <w:b/>
-          <w:color w:val="00648C"/>
-          <w:sz w:val="20"/>
-        </w:rPr>
-        <w:t>jobmind-agent</w:t>
-      </w:r>
-      <w:r>
-        <w:rPr>
-          <w:color w:val="3C3C3C"/>
-          <w:sz w:val="20"/>
-        </w:rPr>
-        <w:t xml:space="preserve"> — CrewAI multi-agent job application pipeline — resume tailoring per job, cover letter generation, interview prep, job portal scanning. Deployed live with Streamlit UI.</w:t>
-      </w:r>
-    </w:p>
-    <w:p>
-      <w:pPr>
-        <w:spacing w:after="80"/>
-      </w:pPr>
-      <w:r>
-        <w:rPr>
-          <w:b/>
-          <w:color w:val="00648C"/>
-          <w:sz w:val="20"/>
-        </w:rPr>
-        <w:t>VA-Opensource-Audit</w:t>
-      </w:r>
-      <w:r>
-        <w:rPr>
-          <w:color w:val="3C3C3C"/>
-          <w:sz w:val="20"/>
-        </w:rPr>
-        <w:t xml:space="preserve"> — Self-hosted SOC dashboard for agentless vulnerability auditing. ClamAV antivirus management and OpenVAS/GVM scanning across Linux servers.</w:t>
-      </w:r>
-    </w:p>
-    <w:p>
-      <w:pPr>
-        <w:spacing w:after="80"/>
-      </w:pPr>
-      <w:r>
-        <w:rPr>
-          <w:b/>
-          <w:color w:val="00648C"/>
-          <w:sz w:val="20"/>
-        </w:rPr>
-        <w:t>xauusd-fvg-algo</w:t>
-      </w:r>
-      <w:r>
-        <w:rPr>
-          <w:color w:val="3C3C3C"/>
-          <w:sz w:val="20"/>
-        </w:rPr>
-        <w:t xml:space="preserve"> — XAUUSD multi-broker automated gold trading system. EMA 20/50 bias + Fair Value Gap entries. OANDA + TOOBIT integration. React dashboard with TradingView-style charts and Telegram alerts.</w:t>
-      </w:r>
-    </w:p>
-    <w:p>
-      <w:pPr>
-        <w:spacing w:after="80"/>
-      </w:pPr>
-      <w:r>
-        <w:rPr>
-          <w:b/>
-          <w:color w:val="00648C"/>
-          <w:sz w:val="20"/>
-        </w:rPr>
-        <w:t>sma_cross_scalp_bot</w:t>
-      </w:r>
-      <w:r>
-        <w:rPr>
-          <w:color w:val="3C3C3C"/>
-          <w:sz w:val="20"/>
-        </w:rPr>
-        <w:t xml:space="preserve"> — 24/7 automated forex/CFD scalping bot. SMA 8/21/50 crossover on M1 timeframe. React dashboard, 75% profit booking logic, ATR consolidation filter.</w:t>
-      </w:r>
-    </w:p>
-    <w:p>
-      <w:pPr>
-        <w:spacing w:after="80"/>
-      </w:pPr>
-      <w:r>
-        <w:rPr>
-          <w:b/>
-          <w:color w:val="00648C"/>
-          <w:sz w:val="20"/>
-        </w:rPr>
-        <w:t>my-brain</w:t>
-      </w:r>
-      <w:r>
-        <w:rPr>
-          <w:color w:val="3C3C3C"/>
-          <w:sz w:val="20"/>
-        </w:rPr>
-        <w:t xml:space="preserve"> — Personal AI brain — knowledge management system with vector embeddings and semantic search for persistent AI agent memory.</w:t>
-      </w:r>
-    </w:p>
-    <w:p>
-      <w:pPr>
-        <w:spacing w:after="80"/>
-      </w:pPr>
-      <w:r>
-        <w:rPr>
-          <w:b/>
-          <w:color w:val="00648C"/>
-          <w:sz w:val="20"/>
-        </w:rPr>
-        <w:t>OBStat</w:t>
-      </w:r>
-      <w:r>
-        <w:rPr>
-          <w:color w:val="3C3C3C"/>
-          <w:sz w:val="20"/>
-        </w:rPr>
-        <w:t xml:space="preserve"> — Order book analytics and statistics platform. Market microstructure analysis for algorithmic trading research.</w:t>
-      </w:r>
-    </w:p>
-    <w:p>
-      <w:pPr>
-        <w:spacing w:after="80"/>
-      </w:pPr>
-      <w:r>
-        <w:rPr>
-          <w:b/>
-          <w:color w:val="00648C"/>
-          <w:sz w:val="20"/>
-        </w:rPr>
-        <w:t>crypto</w:t>
-      </w:r>
-      <w:r>
-        <w:rPr>
-          <w:color w:val="3C3C3C"/>
-          <w:sz w:val="20"/>
-        </w:rPr>
-        <w:t xml:space="preserve"> — Algorithmic trading system for XAUUSD and crypto markets. Python-based real-time price analysis and execution pipeline.</w:t>
-      </w:r>
-    </w:p>
-    <w:p>
-      <w:pPr>
-        <w:spacing w:after="40"/>
-      </w:pPr>
-      <w:r>
-        <w:rPr>
-          <w:b/>
-          <w:color w:val="008CB4"/>
-          <w:sz w:val="26"/>
-        </w:rPr>
-        <w:t>Work Experience</w:t>
-      </w:r>
-    </w:p>
-    <w:p>
-      <w:pPr>
-        <w:spacing w:after="160"/>
-      </w:pPr>
-    </w:p>
-    <w:p>
-      <w:pPr>
-        <w:spacing w:after="20"/>
-      </w:pPr>
-      <w:r>
-        <w:rPr>
-          <w:b/>
-          <w:color w:val="005078"/>
-          <w:sz w:val="21"/>
-        </w:rPr>
-        <w:t>DevOps Engineer — PanApps Inc.</w:t>
-      </w:r>
-    </w:p>
-    <w:p>
-      <w:pPr>
-        <w:spacing w:after="80"/>
-      </w:pPr>
-      <w:r>
-        <w:rPr>
-          <w:i/>
-          <w:color w:val="646464"/>
-          <w:sz w:val="19"/>
-        </w:rPr>
-        <w:t>Recent</w:t>
+        <w:t xml:space="preserve">  —  Recent</w:t>
       </w:r>
     </w:p>
     <w:p>
       <w:pPr>
         <w:pStyle w:val="ListBullet"/>
-        <w:spacing w:after="40"/>
       </w:pPr>
       <w:r>
         <w:rPr>
-          <w:color w:val="323232"/>
-          <w:sz w:val="20"/>
+          <w:sz w:val="19"/>
         </w:rPr>
         <w:t>Managing Linux server infrastructure, Apache/NiFi clusters, and Docker deployments across enterprise clients</w:t>
       </w:r>
@@ -478,12 +104,10 @@
     <w:p>
       <w:pPr>
         <w:pStyle w:val="ListBullet"/>
-        <w:spacing w:after="40"/>
       </w:pPr>
       <w:r>
         <w:rPr>
-          <w:color w:val="323232"/>
-          <w:sz w:val="20"/>
+          <w:sz w:val="19"/>
         </w:rPr>
         <w:t>Implementing CI/CD pipelines with Jenkins and Ansible for automated application deployment</w:t>
       </w:r>
@@ -491,51 +115,38 @@
     <w:p>
       <w:pPr>
         <w:pStyle w:val="ListBullet"/>
-        <w:spacing w:after="40"/>
       </w:pPr>
       <w:r>
         <w:rPr>
-          <w:color w:val="323232"/>
-          <w:sz w:val="20"/>
+          <w:sz w:val="19"/>
         </w:rPr>
         <w:t>Configuring Zabbix monitoring, Wazuh SIEM, and fail2ban for security operations and compliance</w:t>
       </w:r>
     </w:p>
     <w:p>
-      <w:pPr>
-        <w:spacing w:after="20"/>
-      </w:pPr>
       <w:r>
         <w:rPr>
           <w:b/>
-          <w:color w:val="005078"/>
-          <w:sz w:val="21"/>
+          <w:sz w:val="20"/>
         </w:rPr>
         <w:t>System Administrator — Leadership Domestic Workers Service Center</w:t>
       </w:r>
-    </w:p>
-    <w:p>
-      <w:pPr>
-        <w:spacing w:after="80"/>
-      </w:pPr>
       <w:r>
         <w:rPr>
           <w:i/>
-          <w:color w:val="646464"/>
-          <w:sz w:val="19"/>
+          <w:color w:val="808080"/>
+          <w:sz w:val="18"/>
         </w:rPr>
-        <w:t>Dec 2021 – Apr 2023</w:t>
+        <w:t xml:space="preserve">  —  Dec 2021 – Apr 2023</w:t>
       </w:r>
     </w:p>
     <w:p>
       <w:pPr>
         <w:pStyle w:val="ListBullet"/>
-        <w:spacing w:after="40"/>
       </w:pPr>
       <w:r>
         <w:rPr>
-          <w:color w:val="323232"/>
-          <w:sz w:val="20"/>
+          <w:sz w:val="19"/>
         </w:rPr>
         <w:t>Installed, configured, and maintained Windows Server 2016 and Linux-based infrastructure</w:t>
       </w:r>
@@ -543,12 +154,10 @@
     <w:p>
       <w:pPr>
         <w:pStyle w:val="ListBullet"/>
-        <w:spacing w:after="40"/>
       </w:pPr>
       <w:r>
         <w:rPr>
-          <w:color w:val="323232"/>
-          <w:sz w:val="20"/>
+          <w:sz w:val="19"/>
         </w:rPr>
         <w:t>Configured LAN/WAN networks, firewalls, and secure connections for government integrations (MOHRE, ICA)</w:t>
       </w:r>
@@ -556,12 +165,10 @@
     <w:p>
       <w:pPr>
         <w:pStyle w:val="ListBullet"/>
-        <w:spacing w:after="40"/>
       </w:pPr>
       <w:r>
         <w:rPr>
-          <w:color w:val="323232"/>
-          <w:sz w:val="20"/>
+          <w:sz w:val="19"/>
         </w:rPr>
         <w:t>Managed attendance and access control systems; administered IP telephony, mail server, company website</w:t>
       </w:r>
@@ -569,51 +176,38 @@
     <w:p>
       <w:pPr>
         <w:pStyle w:val="ListBullet"/>
-        <w:spacing w:after="40"/>
       </w:pPr>
       <w:r>
         <w:rPr>
-          <w:color w:val="323232"/>
-          <w:sz w:val="20"/>
+          <w:sz w:val="19"/>
         </w:rPr>
         <w:t>Provided remote desktop support across 100+ end users; performed daily network monitoring</w:t>
       </w:r>
     </w:p>
     <w:p>
-      <w:pPr>
-        <w:spacing w:after="20"/>
-      </w:pPr>
       <w:r>
         <w:rPr>
           <w:b/>
-          <w:color w:val="005078"/>
-          <w:sz w:val="21"/>
+          <w:sz w:val="20"/>
         </w:rPr>
         <w:t>Linux System Administrator — IPSR Solutions Ltd</w:t>
       </w:r>
-    </w:p>
-    <w:p>
-      <w:pPr>
-        <w:spacing w:after="80"/>
-      </w:pPr>
       <w:r>
         <w:rPr>
           <w:i/>
-          <w:color w:val="646464"/>
-          <w:sz w:val="19"/>
+          <w:color w:val="808080"/>
+          <w:sz w:val="18"/>
         </w:rPr>
-        <w:t>6 months contract</w:t>
+        <w:t xml:space="preserve">  —  6 months contract</w:t>
       </w:r>
     </w:p>
     <w:p>
       <w:pPr>
         <w:pStyle w:val="ListBullet"/>
-        <w:spacing w:after="40"/>
       </w:pPr>
       <w:r>
         <w:rPr>
-          <w:color w:val="323232"/>
-          <w:sz w:val="20"/>
+          <w:sz w:val="19"/>
         </w:rPr>
         <w:t>Administered Linux servers: kernel upgrades, firewall, SELINUX, LDAP</w:t>
       </w:r>
@@ -621,12 +215,10 @@
     <w:p>
       <w:pPr>
         <w:pStyle w:val="ListBullet"/>
-        <w:spacing w:after="40"/>
       </w:pPr>
       <w:r>
         <w:rPr>
-          <w:color w:val="323232"/>
-          <w:sz w:val="20"/>
+          <w:sz w:val="19"/>
         </w:rPr>
         <w:t>Remote support via SSH; configured Apache, SAMBA, NFS, FTP, ISCSI servers</w:t>
       </w:r>
@@ -634,51 +226,38 @@
     <w:p>
       <w:pPr>
         <w:pStyle w:val="ListBullet"/>
-        <w:spacing w:after="40"/>
       </w:pPr>
       <w:r>
         <w:rPr>
-          <w:color w:val="323232"/>
-          <w:sz w:val="20"/>
+          <w:sz w:val="19"/>
         </w:rPr>
         <w:t>Network monitoring, scheduled backups, user troubleshooting</w:t>
       </w:r>
     </w:p>
     <w:p>
-      <w:pPr>
-        <w:spacing w:after="20"/>
-      </w:pPr>
       <w:r>
         <w:rPr>
           <w:b/>
-          <w:color w:val="005078"/>
-          <w:sz w:val="21"/>
+          <w:sz w:val="20"/>
         </w:rPr>
         <w:t>Network Administrator — Ravis Agencies</w:t>
       </w:r>
-    </w:p>
-    <w:p>
-      <w:pPr>
-        <w:spacing w:after="80"/>
-      </w:pPr>
       <w:r>
         <w:rPr>
           <w:i/>
-          <w:color w:val="646464"/>
-          <w:sz w:val="19"/>
+          <w:color w:val="808080"/>
+          <w:sz w:val="18"/>
         </w:rPr>
-        <w:t>Jun 2014 – Jul 2017 (Part-Time)</w:t>
+        <w:t xml:space="preserve">  —  Jun 2014 – Jul 2017 (Part-Time)</w:t>
       </w:r>
     </w:p>
     <w:p>
       <w:pPr>
         <w:pStyle w:val="ListBullet"/>
-        <w:spacing w:after="40"/>
       </w:pPr>
       <w:r>
         <w:rPr>
-          <w:color w:val="323232"/>
-          <w:sz w:val="20"/>
+          <w:sz w:val="19"/>
         </w:rPr>
         <w:t>Led LAN/WAN establishment and implementation</w:t>
       </w:r>
@@ -686,12 +265,10 @@
     <w:p>
       <w:pPr>
         <w:pStyle w:val="ListBullet"/>
-        <w:spacing w:after="40"/>
       </w:pPr>
       <w:r>
         <w:rPr>
-          <w:color w:val="323232"/>
-          <w:sz w:val="20"/>
+          <w:sz w:val="19"/>
         </w:rPr>
         <w:t>Installed and configured OS; optimized system security and performance</w:t>
       </w:r>
@@ -699,152 +276,362 @@
     <w:p>
       <w:pPr>
         <w:pStyle w:val="ListBullet"/>
-        <w:spacing w:after="40"/>
       </w:pPr>
       <w:r>
         <w:rPr>
-          <w:color w:val="323232"/>
-          <w:sz w:val="20"/>
+          <w:sz w:val="19"/>
         </w:rPr>
         <w:t>Scheduled backups, monitored disk/log usage, implemented IT policies</w:t>
       </w:r>
     </w:p>
+    <w:p/>
     <w:p>
-      <w:pPr>
-        <w:spacing w:after="40"/>
-      </w:pPr>
       <w:r>
         <w:rPr>
           <w:b/>
-          <w:color w:val="008CB4"/>
-          <w:sz w:val="26"/>
+          <w:color w:val="1A375E"/>
+          <w:sz w:val="24"/>
         </w:rPr>
-        <w:t>Certifications &amp; Education</w:t>
+        <w:t>TECHNICAL SKILLS</w:t>
+      </w:r>
+    </w:p>
+    <w:p>
+      <w:r>
+        <w:rPr>
+          <w:b/>
+          <w:sz w:val="19"/>
+        </w:rPr>
+        <w:t xml:space="preserve">OS &amp; Admin: </w:t>
+      </w:r>
+      <w:r>
+        <w:rPr>
+          <w:sz w:val="19"/>
+        </w:rPr>
+        <w:t>Linux (RHEL, CentOS, Fedora, Kali), Windows Server 2016, LVM, SWAP, cron, systemd</w:t>
+      </w:r>
+    </w:p>
+    <w:p>
+      <w:r>
+        <w:rPr>
+          <w:b/>
+          <w:sz w:val="19"/>
+        </w:rPr>
+        <w:t xml:space="preserve">Networking: </w:t>
+      </w:r>
+      <w:r>
+        <w:rPr>
+          <w:sz w:val="19"/>
+        </w:rPr>
+        <w:t>TCP/IP, LAN/WAN, DNS, DHCP, iptables/nftables, SELinux, LDAP</w:t>
+      </w:r>
+    </w:p>
+    <w:p>
+      <w:r>
+        <w:rPr>
+          <w:b/>
+          <w:sz w:val="19"/>
+        </w:rPr>
+        <w:t xml:space="preserve">Servers: </w:t>
+      </w:r>
+      <w:r>
+        <w:rPr>
+          <w:sz w:val="19"/>
+        </w:rPr>
+        <w:t>Apache, Nginx, MySQL/MariaDB, SAMBA, NFS, FTP, ISCSI, Postfix</w:t>
+      </w:r>
+    </w:p>
+    <w:p>
+      <w:r>
+        <w:rPr>
+          <w:b/>
+          <w:sz w:val="19"/>
+        </w:rPr>
+        <w:t xml:space="preserve">DevOps &amp; Cloud: </w:t>
+      </w:r>
+      <w:r>
+        <w:rPr>
+          <w:sz w:val="19"/>
+        </w:rPr>
+        <w:t>Docker, systemd, Apache NiFi, Zabbix, Wazuh SIEM, AWS S3 Backup, CI/CD</w:t>
+      </w:r>
+    </w:p>
+    <w:p>
+      <w:r>
+        <w:rPr>
+          <w:b/>
+          <w:sz w:val="19"/>
+        </w:rPr>
+        <w:t xml:space="preserve">AI / Agentic: </w:t>
+      </w:r>
+      <w:r>
+        <w:rPr>
+          <w:sz w:val="19"/>
+        </w:rPr>
+        <w:t>Python, CrewAI, LangChain, DSPy, ScrapeGraphAI, Hugging Face, AgentDB (HNSW), LangGraph</w:t>
+      </w:r>
+    </w:p>
+    <w:p>
+      <w:r>
+        <w:rPr>
+          <w:b/>
+          <w:sz w:val="19"/>
+        </w:rPr>
+        <w:t xml:space="preserve">Trading Tech: </w:t>
+      </w:r>
+      <w:r>
+        <w:rPr>
+          <w:sz w:val="19"/>
+        </w:rPr>
+        <w:t>Pine Script v5, TradingView MCP, XAUUSD algos, FVG/SMC/ICT strategies</w:t>
+      </w:r>
+    </w:p>
+    <w:p>
+      <w:r>
+        <w:rPr>
+          <w:b/>
+          <w:sz w:val="19"/>
+        </w:rPr>
+        <w:t xml:space="preserve">Certifications: </w:t>
+      </w:r>
+      <w:r>
+        <w:rPr>
+          <w:sz w:val="19"/>
+        </w:rPr>
+        <w:t>RHCSA (ID: 170-179-113), RHCE, Certified Ethical Hacking</w:t>
+      </w:r>
+    </w:p>
+    <w:p/>
+    <w:p>
+      <w:r>
+        <w:rPr>
+          <w:b/>
+          <w:color w:val="1A375E"/>
+          <w:sz w:val="24"/>
+        </w:rPr>
+        <w:t>PROJECTS</w:t>
+      </w:r>
+    </w:p>
+    <w:p>
+      <w:r>
+        <w:rPr>
+          <w:b/>
+          <w:sz w:val="19"/>
+        </w:rPr>
+        <w:t xml:space="preserve">jobmind-agent: </w:t>
+      </w:r>
+      <w:r>
+        <w:rPr>
+          <w:sz w:val="19"/>
+        </w:rPr>
+        <w:t>CrewAI multi-agent job application pipeline — resume tailoring per job, cover letter generation, interview prep, job portal scanning. Deployed live with Streamlit UI.</w:t>
+      </w:r>
+    </w:p>
+    <w:p>
+      <w:r>
+        <w:rPr>
+          <w:b/>
+          <w:sz w:val="19"/>
+        </w:rPr>
+        <w:t xml:space="preserve">VA-Opensource-Audit: </w:t>
+      </w:r>
+      <w:r>
+        <w:rPr>
+          <w:sz w:val="19"/>
+        </w:rPr>
+        <w:t>Self-hosted SOC dashboard for agentless vulnerability auditing. ClamAV antivirus management and OpenVAS/GVM scanning across Linux servers.</w:t>
+      </w:r>
+    </w:p>
+    <w:p>
+      <w:r>
+        <w:rPr>
+          <w:b/>
+          <w:sz w:val="19"/>
+        </w:rPr>
+        <w:t xml:space="preserve">xauusd-fvg-algo: </w:t>
+      </w:r>
+      <w:r>
+        <w:rPr>
+          <w:sz w:val="19"/>
+        </w:rPr>
+        <w:t>XAUUSD multi-broker automated gold trading system. EMA 20/50 bias + Fair Value Gap (FVG) entries. OANDA + TOOBIT integration. React dashboard with TradingView-style charts and Telegram alerts.</w:t>
+      </w:r>
+    </w:p>
+    <w:p>
+      <w:r>
+        <w:rPr>
+          <w:b/>
+          <w:sz w:val="19"/>
+        </w:rPr>
+        <w:t xml:space="preserve">sma_cross_scalp_bot: </w:t>
+      </w:r>
+      <w:r>
+        <w:rPr>
+          <w:sz w:val="19"/>
+        </w:rPr>
+        <w:t>24/7 automated forex/CFD scalping bot. SMA 8/21/50 crossover on M1 timeframe. React dashboard, 75% profit booking logic, ATR consolidation filter.</w:t>
+      </w:r>
+    </w:p>
+    <w:p>
+      <w:r>
+        <w:rPr>
+          <w:b/>
+          <w:sz w:val="19"/>
+        </w:rPr>
+        <w:t xml:space="preserve">my-brain: </w:t>
+      </w:r>
+      <w:r>
+        <w:rPr>
+          <w:sz w:val="19"/>
+        </w:rPr>
+        <w:t>Personal AI brain — knowledge management system with vector embeddings and semantic search for persistent AI agent memory.</w:t>
+      </w:r>
+    </w:p>
+    <w:p>
+      <w:r>
+        <w:rPr>
+          <w:b/>
+          <w:sz w:val="19"/>
+        </w:rPr>
+        <w:t xml:space="preserve">OBStat: </w:t>
+      </w:r>
+      <w:r>
+        <w:rPr>
+          <w:sz w:val="19"/>
+        </w:rPr>
+        <w:t>Order book analytics and statistics platform. Market microstructure analysis for algorithmic trading research.</w:t>
+      </w:r>
+    </w:p>
+    <w:p>
+      <w:r>
+        <w:rPr>
+          <w:b/>
+          <w:sz w:val="19"/>
+        </w:rPr>
+        <w:t xml:space="preserve">crypto: </w:t>
+      </w:r>
+      <w:r>
+        <w:rPr>
+          <w:sz w:val="19"/>
+        </w:rPr>
+        <w:t>Algorithmic trading system for XAUUSD and crypto markets. Python-based real-time price analysis and execution pipeline.</w:t>
+      </w:r>
+    </w:p>
+    <w:p/>
+    <w:p>
+      <w:r>
+        <w:rPr>
+          <w:b/>
+          <w:color w:val="1A375E"/>
+          <w:sz w:val="24"/>
+        </w:rPr>
+        <w:t>COMMUNITY CONTRIBUTIONS</w:t>
+      </w:r>
+    </w:p>
+    <w:p>
+      <w:r>
+        <w:rPr>
+          <w:sz w:val="19"/>
+        </w:rPr>
+        <w:t>Actively contributing to high-impact open source AI projects: ruflo (40k+ stars) — AI Agent Orchestration Platform for Claude; RuView (59k+ stars) — WiFi CSI Spatial Intelligence Platform; RuVector (4k+ stars) — Real-Time Self-Learning Vector GNN Engine.</w:t>
+      </w:r>
+    </w:p>
+    <w:p/>
+    <w:p>
+      <w:r>
+        <w:rPr>
+          <w:b/>
+          <w:color w:val="1A375E"/>
+          <w:sz w:val="24"/>
+        </w:rPr>
+        <w:t>EDUCATION</w:t>
       </w:r>
     </w:p>
     <w:p>
       <w:pPr>
-        <w:spacing w:after="160"/>
-      </w:pPr>
-    </w:p>
-    <w:p>
-      <w:pPr>
-        <w:spacing w:after="60"/>
+        <w:pStyle w:val="ListBullet"/>
       </w:pPr>
       <w:r>
         <w:rPr>
-          <w:b/>
-          <w:color w:val="00648C"/>
-          <w:sz w:val="20"/>
+          <w:sz w:val="19"/>
         </w:rPr>
-        <w:t>Red Hat Certified System Administrator (RHCSA)</w:t>
-      </w:r>
-      <w:r>
-        <w:rPr>
-          <w:color w:val="505050"/>
-          <w:sz w:val="20"/>
-        </w:rPr>
-        <w:t xml:space="preserve"> — Cert ID: 170-179-113</w:t>
+        <w:t>Bachelor of Computer Applications (BCA) — Rabindranath Tagore University</w:t>
       </w:r>
     </w:p>
     <w:p>
       <w:pPr>
-        <w:spacing w:after="60"/>
+        <w:pStyle w:val="ListBullet"/>
       </w:pPr>
       <w:r>
         <w:rPr>
-          <w:b/>
-          <w:color w:val="00648C"/>
-          <w:sz w:val="20"/>
+          <w:sz w:val="19"/>
         </w:rPr>
-        <w:t>Red Hat Certified Engineer (RHCE)</w:t>
-      </w:r>
-      <w:r>
-        <w:rPr>
-          <w:color w:val="505050"/>
-          <w:sz w:val="20"/>
-        </w:rPr>
-        <w:t xml:space="preserve"> — Advanced Linux administration</w:t>
+        <w:t>Bachelor of Commerce with Computer Application — Kerala University</w:t>
       </w:r>
     </w:p>
     <w:p>
       <w:pPr>
-        <w:spacing w:after="60"/>
+        <w:pStyle w:val="ListBullet"/>
       </w:pPr>
       <w:r>
         <w:rPr>
-          <w:b/>
-          <w:color w:val="00648C"/>
-          <w:sz w:val="20"/>
+          <w:sz w:val="19"/>
         </w:rPr>
-        <w:t>Certified Ethical Hacking (CEH)</w:t>
-      </w:r>
-      <w:r>
-        <w:rPr>
-          <w:color w:val="505050"/>
-          <w:sz w:val="20"/>
-        </w:rPr>
-        <w:t xml:space="preserve"> — Security &amp; penetration testing</w:t>
+        <w:t>12th — CBSE</w:t>
       </w:r>
     </w:p>
     <w:p>
       <w:pPr>
-        <w:spacing w:after="60"/>
+        <w:pStyle w:val="ListBullet"/>
       </w:pPr>
       <w:r>
         <w:rPr>
-          <w:b/>
-          <w:color w:val="00648C"/>
-          <w:sz w:val="20"/>
+          <w:sz w:val="19"/>
         </w:rPr>
-        <w:t>Bachelor of Computer Applications</w:t>
+        <w:t>10th — CBSE</w:t>
       </w:r>
+    </w:p>
+    <w:p/>
+    <w:p>
       <w:r>
         <w:rPr>
-          <w:color w:val="505050"/>
-          <w:sz w:val="20"/>
+          <w:b/>
+          <w:color w:val="1A375E"/>
+          <w:sz w:val="24"/>
         </w:rPr>
-        <w:t xml:space="preserve"> — Rabindranath Tagore University</w:t>
+        <w:t>CERTIFICATIONS</w:t>
       </w:r>
     </w:p>
     <w:p>
       <w:pPr>
-        <w:spacing w:after="60"/>
+        <w:pStyle w:val="ListBullet"/>
       </w:pPr>
       <w:r>
         <w:rPr>
-          <w:b/>
-          <w:color w:val="00648C"/>
-          <w:sz w:val="20"/>
+          <w:sz w:val="19"/>
         </w:rPr>
-        <w:t>B.Com with Computer Application</w:t>
-      </w:r>
-      <w:r>
-        <w:rPr>
-          <w:color w:val="505050"/>
-          <w:sz w:val="20"/>
-        </w:rPr>
-        <w:t xml:space="preserve"> — Kerala University</w:t>
+        <w:t>Red Hat Certified System Administrator (RHCSA) — Cert ID: 170-179-113</w:t>
       </w:r>
     </w:p>
     <w:p>
       <w:pPr>
-        <w:spacing w:after="60"/>
+        <w:pStyle w:val="ListBullet"/>
       </w:pPr>
       <w:r>
         <w:rPr>
-          <w:b/>
-          <w:color w:val="00648C"/>
-          <w:sz w:val="20"/>
+          <w:sz w:val="19"/>
         </w:rPr>
-        <w:t>12th &amp; 10th — CBSE</w:t>
+        <w:t>Red Hat Certified Engineer (RHCE)</w:t>
       </w:r>
+    </w:p>
+    <w:p>
+      <w:pPr>
+        <w:pStyle w:val="ListBullet"/>
+      </w:pPr>
       <w:r>
         <w:rPr>
-          <w:color w:val="505050"/>
-          <w:sz w:val="20"/>
+          <w:sz w:val="19"/>
         </w:rPr>
-        <w:t xml:space="preserve"> — Central Board of Secondary Education</w:t>
+        <w:t>Certified Ethical Hacking</w:t>
       </w:r>
     </w:p>
     <w:sectPr>

</xml_diff>

<commit_message>
fix: correct work experience - DevOps Engineer PanApps only, no Freelance/AI Developer added
</commit_message>
<xml_diff>
--- a/Achu_Pradeep_Resume.docx
+++ b/Achu_Pradeep_Resume.docx
@@ -24,7 +24,7 @@
           <w:color w:val="2E86C1"/>
           <w:sz w:val="22"/>
         </w:rPr>
-        <w:t>Linux DevOps Engineer &amp; AI Agent Developer</w:t>
+        <w:t>IT Server Administrator | Linux DevOps Engineer | AI Developer | RHCSA/RHCE</w:t>
       </w:r>
     </w:p>
     <w:p>
@@ -59,7 +59,7 @@
         <w:rPr>
           <w:sz w:val="20"/>
         </w:rPr>
-        <w:t>Linux DevOps engineer with 2.5+ years in IT administration and a growing portfolio of AI/agentic automation projects. RHCSA + RHCE certified. Strong foundation in Linux systems, networking, security — now applying that to build AI-powered pipelines and workflows. Passionate about automating infrastructure and bringing AI agents into production.</w:t>
+        <w:t>Linux DevOps engineer with 2.5+ years in IT administration and a growing portfolio of AI/agentic automation projects. RHCSA + RHCE certified. Strong foundation in Linux systems, networking, security — now applying that to build AI-powered pipelines and workflows. Passionate about automating infrastructure and bringing AI agents into production. Seeking roles in Linux DevOps, SRE, AI Infrastructure, or Security Operations.</w:t>
       </w:r>
     </w:p>
     <w:p/>
@@ -70,7 +70,7 @@
           <w:color w:val="1A375E"/>
           <w:sz w:val="24"/>
         </w:rPr>
-        <w:t>EXPERIENCE</w:t>
+        <w:t>WORK EXPERIENCE</w:t>
       </w:r>
     </w:p>
     <w:p>

</xml_diff>

<commit_message>
Correct open-source section: honest framing (forks/experiments, not authored star-counts)
Co-Authored-By: Claude Opus 4.8 <noreply@anthropic.com>
</commit_message>
<xml_diff>
--- a/Achu_Pradeep_Resume.docx
+++ b/Achu_Pradeep_Resume.docx
@@ -1,647 +1,6 @@
 
-<file path=word/document.xml><?xml version="1.0" encoding="utf-8"?>
-<w:document xmlns:wpc="http://schemas.microsoft.com/office/word/2010/wordprocessingCanvas" xmlns:mo="http://schemas.microsoft.com/office/mac/office/2008/main" xmlns:mc="http://schemas.openxmlformats.org/markup-compatibility/2006" xmlns:mv="urn:schemas-microsoft-com:mac:vml" xmlns:o="urn:schemas-microsoft-com:office:office" xmlns:r="http://schemas.openxmlformats.org/officeDocument/2006/relationships" xmlns:m="http://schemas.openxmlformats.org/officeDocument/2006/math" xmlns:v="urn:schemas-microsoft-com:vml" xmlns:wp14="http://schemas.microsoft.com/office/word/2010/wordprocessingDrawing" xmlns:wp="http://schemas.openxmlformats.org/drawingml/2006/wordprocessingDrawing" xmlns:w10="urn:schemas-microsoft-com:office:word" xmlns:w="http://schemas.openxmlformats.org/wordprocessingml/2006/main" xmlns:w14="http://schemas.microsoft.com/office/word/2010/wordml" xmlns:wpg="http://schemas.microsoft.com/office/word/2010/wordprocessingGroup" xmlns:wpi="http://schemas.microsoft.com/office/word/2010/wordprocessingInk" xmlns:wne="http://schemas.microsoft.com/office/word/2006/wordml" xmlns:wps="http://schemas.microsoft.com/office/word/2010/wordprocessingShape" mc:Ignorable="w14 wp14">
-  <w:body>
-    <w:p>
-      <w:pPr>
-        <w:jc w:val="center"/>
-      </w:pPr>
-      <w:r>
-        <w:rPr>
-          <w:b/>
-          <w:color w:val="1A375E"/>
-          <w:sz w:val="44"/>
-        </w:rPr>
-        <w:t>Achu Pradeep</w:t>
-      </w:r>
-    </w:p>
-    <w:p>
-      <w:pPr>
-        <w:jc w:val="center"/>
-      </w:pPr>
-      <w:r>
-        <w:rPr>
-          <w:color w:val="2E86C1"/>
-          <w:sz w:val="22"/>
-        </w:rPr>
-        <w:t>IT Server Administrator | Linux DevOps Engineer | AI Developer | RHCSA/RHCE</w:t>
-      </w:r>
-    </w:p>
-    <w:p>
-      <w:pPr>
-        <w:jc w:val="center"/>
-      </w:pPr>
-      <w:r>
-        <w:rPr>
-          <w:color w:val="808080"/>
-          <w:sz w:val="18"/>
-        </w:rPr>
-        <w:t>achupradeep3050@gmail.com  |  +91-70557-77055  |  github.com/achupradeep3050  |  Aluva, Kerala, India</w:t>
-      </w:r>
-    </w:p>
-    <w:p>
-      <w:r>
-        <w:t>________________________________________________________________________________</w:t>
-      </w:r>
-    </w:p>
-    <w:p>
-      <w:r>
-        <w:rPr>
-          <w:b/>
-          <w:color w:val="1A375E"/>
-          <w:sz w:val="24"/>
-        </w:rPr>
-        <w:t>SUMMARY</w:t>
-      </w:r>
-    </w:p>
-    <w:p>
-      <w:r>
-        <w:rPr>
-          <w:sz w:val="20"/>
-        </w:rPr>
-        <w:t>Linux DevOps engineer with 2.5+ years in IT administration and a growing portfolio of AI/agentic automation projects. RHCSA + RHCE certified. Strong foundation in Linux systems, networking, security — now applying that to build AI-powered pipelines and workflows. Passionate about automating infrastructure and bringing AI agents into production. Seeking roles in Linux DevOps, SRE, AI Infrastructure, or Security Operations.</w:t>
-      </w:r>
-    </w:p>
-    <w:p/>
-    <w:p>
-      <w:r>
-        <w:rPr>
-          <w:b/>
-          <w:color w:val="1A375E"/>
-          <w:sz w:val="24"/>
-        </w:rPr>
-        <w:t>WORK EXPERIENCE</w:t>
-      </w:r>
-    </w:p>
-    <w:p>
-      <w:r>
-        <w:rPr>
-          <w:b/>
-          <w:sz w:val="20"/>
-        </w:rPr>
-        <w:t>DevOps Engineer — PanApps Inc.</w:t>
-      </w:r>
-      <w:r>
-        <w:rPr>
-          <w:i/>
-          <w:color w:val="808080"/>
-          <w:sz w:val="18"/>
-        </w:rPr>
-        <w:t xml:space="preserve">  —  Recent</w:t>
-      </w:r>
-    </w:p>
-    <w:p>
-      <w:pPr>
-        <w:pStyle w:val="ListBullet"/>
-      </w:pPr>
-      <w:r>
-        <w:rPr>
-          <w:sz w:val="19"/>
-        </w:rPr>
-        <w:t>Managing Linux server infrastructure, Apache/NiFi clusters, and Docker deployments across enterprise clients</w:t>
-      </w:r>
-    </w:p>
-    <w:p>
-      <w:pPr>
-        <w:pStyle w:val="ListBullet"/>
-      </w:pPr>
-      <w:r>
-        <w:rPr>
-          <w:sz w:val="19"/>
-        </w:rPr>
-        <w:t>Implementing CI/CD pipelines with Jenkins and Ansible for automated application deployment</w:t>
-      </w:r>
-    </w:p>
-    <w:p>
-      <w:pPr>
-        <w:pStyle w:val="ListBullet"/>
-      </w:pPr>
-      <w:r>
-        <w:rPr>
-          <w:sz w:val="19"/>
-        </w:rPr>
-        <w:t>Configuring Zabbix monitoring, Wazuh SIEM, and fail2ban for security operations and compliance</w:t>
-      </w:r>
-    </w:p>
-    <w:p>
-      <w:r>
-        <w:rPr>
-          <w:b/>
-          <w:sz w:val="20"/>
-        </w:rPr>
-        <w:t>System Administrator — Leadership Domestic Workers Service Center</w:t>
-      </w:r>
-      <w:r>
-        <w:rPr>
-          <w:i/>
-          <w:color w:val="808080"/>
-          <w:sz w:val="18"/>
-        </w:rPr>
-        <w:t xml:space="preserve">  —  Dec 2021 – Apr 2023</w:t>
-      </w:r>
-    </w:p>
-    <w:p>
-      <w:pPr>
-        <w:pStyle w:val="ListBullet"/>
-      </w:pPr>
-      <w:r>
-        <w:rPr>
-          <w:sz w:val="19"/>
-        </w:rPr>
-        <w:t>Installed, configured, and maintained Windows Server 2016 and Linux-based infrastructure</w:t>
-      </w:r>
-    </w:p>
-    <w:p>
-      <w:pPr>
-        <w:pStyle w:val="ListBullet"/>
-      </w:pPr>
-      <w:r>
-        <w:rPr>
-          <w:sz w:val="19"/>
-        </w:rPr>
-        <w:t>Configured LAN/WAN networks, firewalls, and secure connections for government integrations (MOHRE, ICA)</w:t>
-      </w:r>
-    </w:p>
-    <w:p>
-      <w:pPr>
-        <w:pStyle w:val="ListBullet"/>
-      </w:pPr>
-      <w:r>
-        <w:rPr>
-          <w:sz w:val="19"/>
-        </w:rPr>
-        <w:t>Managed attendance and access control systems; administered IP telephony, mail server, company website</w:t>
-      </w:r>
-    </w:p>
-    <w:p>
-      <w:pPr>
-        <w:pStyle w:val="ListBullet"/>
-      </w:pPr>
-      <w:r>
-        <w:rPr>
-          <w:sz w:val="19"/>
-        </w:rPr>
-        <w:t>Provided remote desktop support across 100+ end users; performed daily network monitoring</w:t>
-      </w:r>
-    </w:p>
-    <w:p>
-      <w:r>
-        <w:rPr>
-          <w:b/>
-          <w:sz w:val="20"/>
-        </w:rPr>
-        <w:t>Linux System Administrator — IPSR Solutions Ltd</w:t>
-      </w:r>
-      <w:r>
-        <w:rPr>
-          <w:i/>
-          <w:color w:val="808080"/>
-          <w:sz w:val="18"/>
-        </w:rPr>
-        <w:t xml:space="preserve">  —  6 months contract</w:t>
-      </w:r>
-    </w:p>
-    <w:p>
-      <w:pPr>
-        <w:pStyle w:val="ListBullet"/>
-      </w:pPr>
-      <w:r>
-        <w:rPr>
-          <w:sz w:val="19"/>
-        </w:rPr>
-        <w:t>Administered Linux servers: kernel upgrades, firewall, SELINUX, LDAP</w:t>
-      </w:r>
-    </w:p>
-    <w:p>
-      <w:pPr>
-        <w:pStyle w:val="ListBullet"/>
-      </w:pPr>
-      <w:r>
-        <w:rPr>
-          <w:sz w:val="19"/>
-        </w:rPr>
-        <w:t>Remote support via SSH; configured Apache, SAMBA, NFS, FTP, ISCSI servers</w:t>
-      </w:r>
-    </w:p>
-    <w:p>
-      <w:pPr>
-        <w:pStyle w:val="ListBullet"/>
-      </w:pPr>
-      <w:r>
-        <w:rPr>
-          <w:sz w:val="19"/>
-        </w:rPr>
-        <w:t>Network monitoring, scheduled backups, user troubleshooting</w:t>
-      </w:r>
-    </w:p>
-    <w:p>
-      <w:r>
-        <w:rPr>
-          <w:b/>
-          <w:sz w:val="20"/>
-        </w:rPr>
-        <w:t>Network Administrator — Ravis Agencies</w:t>
-      </w:r>
-      <w:r>
-        <w:rPr>
-          <w:i/>
-          <w:color w:val="808080"/>
-          <w:sz w:val="18"/>
-        </w:rPr>
-        <w:t xml:space="preserve">  —  Jun 2014 – Jul 2017 (Part-Time)</w:t>
-      </w:r>
-    </w:p>
-    <w:p>
-      <w:pPr>
-        <w:pStyle w:val="ListBullet"/>
-      </w:pPr>
-      <w:r>
-        <w:rPr>
-          <w:sz w:val="19"/>
-        </w:rPr>
-        <w:t>Led LAN/WAN establishment and implementation</w:t>
-      </w:r>
-    </w:p>
-    <w:p>
-      <w:pPr>
-        <w:pStyle w:val="ListBullet"/>
-      </w:pPr>
-      <w:r>
-        <w:rPr>
-          <w:sz w:val="19"/>
-        </w:rPr>
-        <w:t>Installed and configured OS; optimized system security and performance</w:t>
-      </w:r>
-    </w:p>
-    <w:p>
-      <w:pPr>
-        <w:pStyle w:val="ListBullet"/>
-      </w:pPr>
-      <w:r>
-        <w:rPr>
-          <w:sz w:val="19"/>
-        </w:rPr>
-        <w:t>Scheduled backups, monitored disk/log usage, implemented IT policies</w:t>
-      </w:r>
-    </w:p>
-    <w:p/>
-    <w:p>
-      <w:r>
-        <w:rPr>
-          <w:b/>
-          <w:color w:val="1A375E"/>
-          <w:sz w:val="24"/>
-        </w:rPr>
-        <w:t>TECHNICAL SKILLS</w:t>
-      </w:r>
-    </w:p>
-    <w:p>
-      <w:r>
-        <w:rPr>
-          <w:b/>
-          <w:sz w:val="19"/>
-        </w:rPr>
-        <w:t xml:space="preserve">OS &amp; Admin: </w:t>
-      </w:r>
-      <w:r>
-        <w:rPr>
-          <w:sz w:val="19"/>
-        </w:rPr>
-        <w:t>Linux (RHEL, CentOS, Fedora, Kali), Windows Server 2016, LVM, SWAP, cron, systemd</w:t>
-      </w:r>
-    </w:p>
-    <w:p>
-      <w:r>
-        <w:rPr>
-          <w:b/>
-          <w:sz w:val="19"/>
-        </w:rPr>
-        <w:t xml:space="preserve">Networking: </w:t>
-      </w:r>
-      <w:r>
-        <w:rPr>
-          <w:sz w:val="19"/>
-        </w:rPr>
-        <w:t>TCP/IP, LAN/WAN, DNS, DHCP, iptables/nftables, SELinux, LDAP</w:t>
-      </w:r>
-    </w:p>
-    <w:p>
-      <w:r>
-        <w:rPr>
-          <w:b/>
-          <w:sz w:val="19"/>
-        </w:rPr>
-        <w:t xml:space="preserve">Servers: </w:t>
-      </w:r>
-      <w:r>
-        <w:rPr>
-          <w:sz w:val="19"/>
-        </w:rPr>
-        <w:t>Apache, Nginx, MySQL/MariaDB, SAMBA, NFS, FTP, ISCSI, Postfix</w:t>
-      </w:r>
-    </w:p>
-    <w:p>
-      <w:r>
-        <w:rPr>
-          <w:b/>
-          <w:sz w:val="19"/>
-        </w:rPr>
-        <w:t xml:space="preserve">DevOps &amp; Cloud: </w:t>
-      </w:r>
-      <w:r>
-        <w:rPr>
-          <w:sz w:val="19"/>
-        </w:rPr>
-        <w:t>Docker, systemd, Apache NiFi, Zabbix, Wazuh SIEM, AWS S3 Backup, CI/CD</w:t>
-      </w:r>
-    </w:p>
-    <w:p>
-      <w:r>
-        <w:rPr>
-          <w:b/>
-          <w:sz w:val="19"/>
-        </w:rPr>
-        <w:t xml:space="preserve">AI / Agentic: </w:t>
-      </w:r>
-      <w:r>
-        <w:rPr>
-          <w:sz w:val="19"/>
-        </w:rPr>
-        <w:t>Python, CrewAI, LangChain, DSPy, ScrapeGraphAI, Hugging Face, AgentDB (HNSW), LangGraph</w:t>
-      </w:r>
-    </w:p>
-    <w:p>
-      <w:r>
-        <w:rPr>
-          <w:b/>
-          <w:sz w:val="19"/>
-        </w:rPr>
-        <w:t xml:space="preserve">Trading Tech: </w:t>
-      </w:r>
-      <w:r>
-        <w:rPr>
-          <w:sz w:val="19"/>
-        </w:rPr>
-        <w:t>Pine Script v5, TradingView MCP, XAUUSD algos, FVG/SMC/ICT strategies</w:t>
-      </w:r>
-    </w:p>
-    <w:p>
-      <w:r>
-        <w:rPr>
-          <w:b/>
-          <w:sz w:val="19"/>
-        </w:rPr>
-        <w:t xml:space="preserve">Certifications: </w:t>
-      </w:r>
-      <w:r>
-        <w:rPr>
-          <w:sz w:val="19"/>
-        </w:rPr>
-        <w:t>RHCSA (ID: 170-179-113), RHCE, Certified Ethical Hacking</w:t>
-      </w:r>
-    </w:p>
-    <w:p/>
-    <w:p>
-      <w:r>
-        <w:rPr>
-          <w:b/>
-          <w:color w:val="1A375E"/>
-          <w:sz w:val="24"/>
-        </w:rPr>
-        <w:t>PROJECTS</w:t>
-      </w:r>
-    </w:p>
-    <w:p>
-      <w:r>
-        <w:rPr>
-          <w:b/>
-          <w:sz w:val="19"/>
-        </w:rPr>
-        <w:t xml:space="preserve">jobmind-agent: </w:t>
-      </w:r>
-      <w:r>
-        <w:rPr>
-          <w:sz w:val="19"/>
-        </w:rPr>
-        <w:t>CrewAI multi-agent job application pipeline — resume tailoring per job, cover letter generation, interview prep, job portal scanning. Deployed live with Streamlit UI.</w:t>
-      </w:r>
-    </w:p>
-    <w:p>
-      <w:r>
-        <w:rPr>
-          <w:b/>
-          <w:sz w:val="19"/>
-        </w:rPr>
-        <w:t xml:space="preserve">VA-Opensource-Audit: </w:t>
-      </w:r>
-      <w:r>
-        <w:rPr>
-          <w:sz w:val="19"/>
-        </w:rPr>
-        <w:t>Self-hosted SOC dashboard for agentless vulnerability auditing. ClamAV antivirus management and OpenVAS/GVM scanning across Linux servers.</w:t>
-      </w:r>
-    </w:p>
-    <w:p>
-      <w:r>
-        <w:rPr>
-          <w:b/>
-          <w:sz w:val="19"/>
-        </w:rPr>
-        <w:t xml:space="preserve">xauusd-fvg-algo: </w:t>
-      </w:r>
-      <w:r>
-        <w:rPr>
-          <w:sz w:val="19"/>
-        </w:rPr>
-        <w:t>XAUUSD multi-broker automated gold trading system. EMA 20/50 bias + Fair Value Gap (FVG) entries. OANDA + TOOBIT integration. React dashboard with TradingView-style charts and Telegram alerts.</w:t>
-      </w:r>
-    </w:p>
-    <w:p>
-      <w:r>
-        <w:rPr>
-          <w:b/>
-          <w:sz w:val="19"/>
-        </w:rPr>
-        <w:t xml:space="preserve">sma_cross_scalp_bot: </w:t>
-      </w:r>
-      <w:r>
-        <w:rPr>
-          <w:sz w:val="19"/>
-        </w:rPr>
-        <w:t>24/7 automated forex/CFD scalping bot. SMA 8/21/50 crossover on M1 timeframe. React dashboard, 75% profit booking logic, ATR consolidation filter.</w:t>
-      </w:r>
-    </w:p>
-    <w:p>
-      <w:r>
-        <w:rPr>
-          <w:b/>
-          <w:sz w:val="19"/>
-        </w:rPr>
-        <w:t xml:space="preserve">my-brain: </w:t>
-      </w:r>
-      <w:r>
-        <w:rPr>
-          <w:sz w:val="19"/>
-        </w:rPr>
-        <w:t>Personal AI brain — knowledge management system with vector embeddings and semantic search for persistent AI agent memory.</w:t>
-      </w:r>
-    </w:p>
-    <w:p>
-      <w:r>
-        <w:rPr>
-          <w:b/>
-          <w:sz w:val="19"/>
-        </w:rPr>
-        <w:t xml:space="preserve">OBStat: </w:t>
-      </w:r>
-      <w:r>
-        <w:rPr>
-          <w:sz w:val="19"/>
-        </w:rPr>
-        <w:t>Order book analytics and statistics platform. Market microstructure analysis for algorithmic trading research.</w:t>
-      </w:r>
-    </w:p>
-    <w:p>
-      <w:r>
-        <w:rPr>
-          <w:b/>
-          <w:sz w:val="19"/>
-        </w:rPr>
-        <w:t xml:space="preserve">crypto: </w:t>
-      </w:r>
-      <w:r>
-        <w:rPr>
-          <w:sz w:val="19"/>
-        </w:rPr>
-        <w:t>Algorithmic trading system for XAUUSD and crypto markets. Python-based real-time price analysis and execution pipeline.</w:t>
-      </w:r>
-    </w:p>
-    <w:p/>
-    <w:p>
-      <w:r>
-        <w:rPr>
-          <w:b/>
-          <w:color w:val="1A375E"/>
-          <w:sz w:val="24"/>
-        </w:rPr>
-        <w:t>COMMUNITY CONTRIBUTIONS</w:t>
-      </w:r>
-    </w:p>
-    <w:p>
-      <w:r>
-        <w:rPr>
-          <w:sz w:val="19"/>
-        </w:rPr>
-        <w:t>Actively contributing to high-impact open source AI projects: ruflo (40k+ stars) — AI Agent Orchestration Platform for Claude; RuView (59k+ stars) — WiFi CSI Spatial Intelligence Platform; RuVector (4k+ stars) — Real-Time Self-Learning Vector GNN Engine.</w:t>
-      </w:r>
-    </w:p>
-    <w:p/>
-    <w:p>
-      <w:r>
-        <w:rPr>
-          <w:b/>
-          <w:color w:val="1A375E"/>
-          <w:sz w:val="24"/>
-        </w:rPr>
-        <w:t>EDUCATION</w:t>
-      </w:r>
-    </w:p>
-    <w:p>
-      <w:pPr>
-        <w:pStyle w:val="ListBullet"/>
-      </w:pPr>
-      <w:r>
-        <w:rPr>
-          <w:sz w:val="19"/>
-        </w:rPr>
-        <w:t>Bachelor of Computer Applications (BCA) — Rabindranath Tagore University</w:t>
-      </w:r>
-    </w:p>
-    <w:p>
-      <w:pPr>
-        <w:pStyle w:val="ListBullet"/>
-      </w:pPr>
-      <w:r>
-        <w:rPr>
-          <w:sz w:val="19"/>
-        </w:rPr>
-        <w:t>Bachelor of Commerce with Computer Application — Kerala University</w:t>
-      </w:r>
-    </w:p>
-    <w:p>
-      <w:pPr>
-        <w:pStyle w:val="ListBullet"/>
-      </w:pPr>
-      <w:r>
-        <w:rPr>
-          <w:sz w:val="19"/>
-        </w:rPr>
-        <w:t>12th — CBSE</w:t>
-      </w:r>
-    </w:p>
-    <w:p>
-      <w:pPr>
-        <w:pStyle w:val="ListBullet"/>
-      </w:pPr>
-      <w:r>
-        <w:rPr>
-          <w:sz w:val="19"/>
-        </w:rPr>
-        <w:t>10th — CBSE</w:t>
-      </w:r>
-    </w:p>
-    <w:p/>
-    <w:p>
-      <w:r>
-        <w:rPr>
-          <w:b/>
-          <w:color w:val="1A375E"/>
-          <w:sz w:val="24"/>
-        </w:rPr>
-        <w:t>CERTIFICATIONS</w:t>
-      </w:r>
-    </w:p>
-    <w:p>
-      <w:pPr>
-        <w:pStyle w:val="ListBullet"/>
-      </w:pPr>
-      <w:r>
-        <w:rPr>
-          <w:sz w:val="19"/>
-        </w:rPr>
-        <w:t>Red Hat Certified System Administrator (RHCSA) — Cert ID: 170-179-113</w:t>
-      </w:r>
-    </w:p>
-    <w:p>
-      <w:pPr>
-        <w:pStyle w:val="ListBullet"/>
-      </w:pPr>
-      <w:r>
-        <w:rPr>
-          <w:sz w:val="19"/>
-        </w:rPr>
-        <w:t>Red Hat Certified Engineer (RHCE)</w:t>
-      </w:r>
-    </w:p>
-    <w:p>
-      <w:pPr>
-        <w:pStyle w:val="ListBullet"/>
-      </w:pPr>
-      <w:r>
-        <w:rPr>
-          <w:sz w:val="19"/>
-        </w:rPr>
-        <w:t>Certified Ethical Hacking</w:t>
-      </w:r>
-    </w:p>
-    <w:sectPr>
-      <w:pgSz w:w="12240" w:h="15840"/>
-      <w:pgMar w:top="864" w:right="864" w:bottom="864" w:left="864" w:header="720" w:footer="720" w:gutter="0"/>
-      <w:cols w:space="720"/>
-      <w:docGrid w:linePitch="360"/>
-    </w:sectPr>
-  </w:body>
-</w:document>
+<file path=word/document.xml><?xml version='1.0' encoding='UTF-8' standalone='yes'?>
+<w:document xmlns:wpc="http://schemas.microsoft.com/office/word/2010/wordprocessingCanvas" xmlns:mo="http://schemas.microsoft.com/office/mac/office/2008/main" xmlns:mc="http://schemas.openxmlformats.org/markup-compatibility/2006" xmlns:mv="urn:schemas-microsoft-com:mac:vml" xmlns:o="urn:schemas-microsoft-com:office:office" xmlns:r="http://schemas.openxmlformats.org/officeDocument/2006/relationships" xmlns:m="http://schemas.openxmlformats.org/officeDocument/2006/math" xmlns:v="urn:schemas-microsoft-com:vml" xmlns:wp14="http://schemas.microsoft.com/office/word/2010/wordprocessingDrawing" xmlns:wp="http://schemas.openxmlformats.org/drawingml/2006/wordprocessingDrawing" xmlns:w10="urn:schemas-microsoft-com:office:word" xmlns:w="http://schemas.openxmlformats.org/wordprocessingml/2006/main" xmlns:w14="http://schemas.microsoft.com/office/word/2010/wordml" xmlns:wpg="http://schemas.microsoft.com/office/word/2010/wordprocessingGroup" xmlns:wpi="http://schemas.microsoft.com/office/word/2010/wordprocessingInk" xmlns:wne="http://schemas.microsoft.com/office/word/2006/wordml" xmlns:wps="http://schemas.microsoft.com/office/word/2010/wordprocessingShape" mc:Ignorable="w14 wp14"><w:body><w:p><w:pPr><w:jc w:val="center"/></w:pPr><w:r><w:rPr><w:b/><w:color w:val="1A375E"/><w:sz w:val="44"/></w:rPr><w:t>Achu Pradeep</w:t></w:r></w:p><w:p><w:pPr><w:jc w:val="center"/></w:pPr><w:r><w:rPr><w:color w:val="2E86C1"/><w:sz w:val="22"/></w:rPr><w:t>IT Server Administrator | Linux DevOps Engineer | AI Developer | RHCSA/RHCE</w:t></w:r></w:p><w:p><w:pPr><w:jc w:val="center"/></w:pPr><w:r><w:rPr><w:color w:val="808080"/><w:sz w:val="18"/></w:rPr><w:t>achupradeep3050@gmail.com  |  +91-70557-77055  |  github.com/achupradeep3050  |  Aluva, Kerala, India</w:t></w:r></w:p><w:p><w:r><w:t>________________________________________________________________________________</w:t></w:r></w:p><w:p><w:r><w:rPr><w:b/><w:color w:val="1A375E"/><w:sz w:val="24"/></w:rPr><w:t>SUMMARY</w:t></w:r></w:p><w:p><w:r><w:rPr><w:sz w:val="20"/></w:rPr><w:t>Linux DevOps engineer with 2.5+ years in IT administration and a growing portfolio of AI/agentic automation projects. RHCSA + RHCE certified. Strong foundation in Linux systems, networking, security — now applying that to build AI-powered pipelines and workflows. Passionate about automating infrastructure and bringing AI agents into production. Seeking roles in Linux DevOps, SRE, AI Infrastructure, or Security Operations.</w:t></w:r></w:p><w:p/><w:p><w:r><w:rPr><w:b/><w:color w:val="1A375E"/><w:sz w:val="24"/></w:rPr><w:t>WORK EXPERIENCE</w:t></w:r></w:p><w:p><w:r><w:rPr><w:b/><w:sz w:val="20"/></w:rPr><w:t>DevOps Engineer — PanApps Inc.</w:t></w:r><w:r><w:rPr><w:i/><w:color w:val="808080"/><w:sz w:val="18"/></w:rPr><w:t xml:space="preserve">  —  Recent</w:t></w:r></w:p><w:p><w:pPr><w:pStyle w:val="ListBullet"/></w:pPr><w:r><w:rPr><w:sz w:val="19"/></w:rPr><w:t>Managing Linux server infrastructure, Apache/NiFi clusters, and Docker deployments across enterprise clients</w:t></w:r></w:p><w:p><w:pPr><w:pStyle w:val="ListBullet"/></w:pPr><w:r><w:rPr><w:sz w:val="19"/></w:rPr><w:t>Implementing CI/CD pipelines with Jenkins and Ansible for automated application deployment</w:t></w:r></w:p><w:p><w:pPr><w:pStyle w:val="ListBullet"/></w:pPr><w:r><w:rPr><w:sz w:val="19"/></w:rPr><w:t>Configuring Zabbix monitoring, Wazuh SIEM, and fail2ban for security operations and compliance</w:t></w:r></w:p><w:p><w:r><w:rPr><w:b/><w:sz w:val="20"/></w:rPr><w:t>System Administrator — Leadership Domestic Workers Service Center</w:t></w:r><w:r><w:rPr><w:i/><w:color w:val="808080"/><w:sz w:val="18"/></w:rPr><w:t xml:space="preserve">  —  Dec 2021 – Apr 2023</w:t></w:r></w:p><w:p><w:pPr><w:pStyle w:val="ListBullet"/></w:pPr><w:r><w:rPr><w:sz w:val="19"/></w:rPr><w:t>Installed, configured, and maintained Windows Server 2016 and Linux-based infrastructure</w:t></w:r></w:p><w:p><w:pPr><w:pStyle w:val="ListBullet"/></w:pPr><w:r><w:rPr><w:sz w:val="19"/></w:rPr><w:t>Configured LAN/WAN networks, firewalls, and secure connections for government integrations (MOHRE, ICA)</w:t></w:r></w:p><w:p><w:pPr><w:pStyle w:val="ListBullet"/></w:pPr><w:r><w:rPr><w:sz w:val="19"/></w:rPr><w:t>Managed attendance and access control systems; administered IP telephony, mail server, company website</w:t></w:r></w:p><w:p><w:pPr><w:pStyle w:val="ListBullet"/></w:pPr><w:r><w:rPr><w:sz w:val="19"/></w:rPr><w:t>Provided remote desktop support across 100+ end users; performed daily network monitoring</w:t></w:r></w:p><w:p><w:r><w:rPr><w:b/><w:sz w:val="20"/></w:rPr><w:t>Linux System Administrator — IPSR Solutions Ltd</w:t></w:r><w:r><w:rPr><w:i/><w:color w:val="808080"/><w:sz w:val="18"/></w:rPr><w:t xml:space="preserve">  —  6 months contract</w:t></w:r></w:p><w:p><w:pPr><w:pStyle w:val="ListBullet"/></w:pPr><w:r><w:rPr><w:sz w:val="19"/></w:rPr><w:t>Administered Linux servers: kernel upgrades, firewall, SELINUX, LDAP</w:t></w:r></w:p><w:p><w:pPr><w:pStyle w:val="ListBullet"/></w:pPr><w:r><w:rPr><w:sz w:val="19"/></w:rPr><w:t>Remote support via SSH; configured Apache, SAMBA, NFS, FTP, ISCSI servers</w:t></w:r></w:p><w:p><w:pPr><w:pStyle w:val="ListBullet"/></w:pPr><w:r><w:rPr><w:sz w:val="19"/></w:rPr><w:t>Network monitoring, scheduled backups, user troubleshooting</w:t></w:r></w:p><w:p><w:r><w:rPr><w:b/><w:sz w:val="20"/></w:rPr><w:t>Network Administrator — Ravis Agencies</w:t></w:r><w:r><w:rPr><w:i/><w:color w:val="808080"/><w:sz w:val="18"/></w:rPr><w:t xml:space="preserve">  —  Jun 2014 – Jul 2017 (Part-Time)</w:t></w:r></w:p><w:p><w:pPr><w:pStyle w:val="ListBullet"/></w:pPr><w:r><w:rPr><w:sz w:val="19"/></w:rPr><w:t>Led LAN/WAN establishment and implementation</w:t></w:r></w:p><w:p><w:pPr><w:pStyle w:val="ListBullet"/></w:pPr><w:r><w:rPr><w:sz w:val="19"/></w:rPr><w:t>Installed and configured OS; optimized system security and performance</w:t></w:r></w:p><w:p><w:pPr><w:pStyle w:val="ListBullet"/></w:pPr><w:r><w:rPr><w:sz w:val="19"/></w:rPr><w:t>Scheduled backups, monitored disk/log usage, implemented IT policies</w:t></w:r></w:p><w:p/><w:p><w:r><w:rPr><w:b/><w:color w:val="1A375E"/><w:sz w:val="24"/></w:rPr><w:t>TECHNICAL SKILLS</w:t></w:r></w:p><w:p><w:r><w:rPr><w:b/><w:sz w:val="19"/></w:rPr><w:t xml:space="preserve">OS &amp; Admin: </w:t></w:r><w:r><w:rPr><w:sz w:val="19"/></w:rPr><w:t>Linux (RHEL, CentOS, Fedora, Kali), Windows Server 2016, LVM, SWAP, cron, systemd</w:t></w:r></w:p><w:p><w:r><w:rPr><w:b/><w:sz w:val="19"/></w:rPr><w:t xml:space="preserve">Networking: </w:t></w:r><w:r><w:rPr><w:sz w:val="19"/></w:rPr><w:t>TCP/IP, LAN/WAN, DNS, DHCP, iptables/nftables, SELinux, LDAP</w:t></w:r></w:p><w:p><w:r><w:rPr><w:b/><w:sz w:val="19"/></w:rPr><w:t xml:space="preserve">Servers: </w:t></w:r><w:r><w:rPr><w:sz w:val="19"/></w:rPr><w:t>Apache, Nginx, MySQL/MariaDB, SAMBA, NFS, FTP, ISCSI, Postfix</w:t></w:r></w:p><w:p><w:r><w:rPr><w:b/><w:sz w:val="19"/></w:rPr><w:t xml:space="preserve">DevOps &amp; Cloud: </w:t></w:r><w:r><w:rPr><w:sz w:val="19"/></w:rPr><w:t>Docker, systemd, Apache NiFi, Zabbix, Wazuh SIEM, AWS S3 Backup, CI/CD</w:t></w:r></w:p><w:p><w:r><w:rPr><w:b/><w:sz w:val="19"/></w:rPr><w:t xml:space="preserve">AI / Agentic: </w:t></w:r><w:r><w:rPr><w:sz w:val="19"/></w:rPr><w:t>Python, CrewAI, LangChain, DSPy, ScrapeGraphAI, Hugging Face, AgentDB (HNSW), LangGraph</w:t></w:r></w:p><w:p><w:r><w:rPr><w:b/><w:sz w:val="19"/></w:rPr><w:t xml:space="preserve">Trading Tech: </w:t></w:r><w:r><w:rPr><w:sz w:val="19"/></w:rPr><w:t>Pine Script v5, TradingView MCP, XAUUSD algos, FVG/SMC/ICT strategies</w:t></w:r></w:p><w:p><w:r><w:rPr><w:b/><w:sz w:val="19"/></w:rPr><w:t xml:space="preserve">Certifications: </w:t></w:r><w:r><w:rPr><w:sz w:val="19"/></w:rPr><w:t>RHCSA (ID: 170-179-113), RHCE, Certified Ethical Hacking</w:t></w:r></w:p><w:p/><w:p><w:r><w:rPr><w:b/><w:color w:val="1A375E"/><w:sz w:val="24"/></w:rPr><w:t>PROJECTS</w:t></w:r></w:p><w:p><w:r><w:rPr><w:b/><w:sz w:val="19"/></w:rPr><w:t xml:space="preserve">jobmind-agent: </w:t></w:r><w:r><w:rPr><w:sz w:val="19"/></w:rPr><w:t>CrewAI multi-agent job application pipeline — resume tailoring per job, cover letter generation, interview prep, job portal scanning. Deployed live with Streamlit UI.</w:t></w:r></w:p><w:p><w:r><w:rPr><w:b/><w:sz w:val="19"/></w:rPr><w:t xml:space="preserve">VA-Opensource-Audit: </w:t></w:r><w:r><w:rPr><w:sz w:val="19"/></w:rPr><w:t>Self-hosted SOC dashboard for agentless vulnerability auditing. ClamAV antivirus management and OpenVAS/GVM scanning across Linux servers.</w:t></w:r></w:p><w:p><w:r><w:rPr><w:b/><w:sz w:val="19"/></w:rPr><w:t xml:space="preserve">xauusd-fvg-algo: </w:t></w:r><w:r><w:rPr><w:sz w:val="19"/></w:rPr><w:t>XAUUSD multi-broker automated gold trading system. EMA 20/50 bias + Fair Value Gap (FVG) entries. OANDA + TOOBIT integration. React dashboard with TradingView-style charts and Telegram alerts.</w:t></w:r></w:p><w:p><w:r><w:rPr><w:b/><w:sz w:val="19"/></w:rPr><w:t xml:space="preserve">sma_cross_scalp_bot: </w:t></w:r><w:r><w:rPr><w:sz w:val="19"/></w:rPr><w:t>24/7 automated forex/CFD scalping bot. SMA 8/21/50 crossover on M1 timeframe. React dashboard, 75% profit booking logic, ATR consolidation filter.</w:t></w:r></w:p><w:p><w:r><w:rPr><w:b/><w:sz w:val="19"/></w:rPr><w:t xml:space="preserve">my-brain: </w:t></w:r><w:r><w:rPr><w:sz w:val="19"/></w:rPr><w:t>Personal AI brain — knowledge management system with vector embeddings and semantic search for persistent AI agent memory.</w:t></w:r></w:p><w:p><w:r><w:rPr><w:b/><w:sz w:val="19"/></w:rPr><w:t xml:space="preserve">OBStat: </w:t></w:r><w:r><w:rPr><w:sz w:val="19"/></w:rPr><w:t>Order book analytics and statistics platform. Market microstructure analysis for algorithmic trading research.</w:t></w:r></w:p><w:p><w:r><w:rPr><w:b/><w:sz w:val="19"/></w:rPr><w:t xml:space="preserve">crypto: </w:t></w:r><w:r><w:rPr><w:sz w:val="19"/></w:rPr><w:t>Algorithmic trading system for XAUUSD and crypto markets. Python-based real-time price analysis and execution pipeline.</w:t></w:r></w:p><w:p/><w:p><w:r><w:rPr><w:b/><w:color w:val="1A375E"/><w:sz w:val="24"/></w:rPr><w:t>OPEN SOURCE & EXPLORATION</w:t></w:r></w:p><w:p><w:r><w:rPr><w:sz w:val="19"/></w:rPr><w:t>Actively follows and experiments with leading open-source agent/AI frameworks (Hermes Agent, InsForge, TradingView-MCP, deer-flow, and more), adapting them into personal trading and DevOps projects.</w:t></w:r></w:p><w:p/><w:p><w:r><w:rPr><w:b/><w:color w:val="1A375E"/><w:sz w:val="24"/></w:rPr><w:t>EDUCATION</w:t></w:r></w:p><w:p><w:pPr><w:pStyle w:val="ListBullet"/></w:pPr><w:r><w:rPr><w:sz w:val="19"/></w:rPr><w:t>Bachelor of Computer Applications (BCA) — Rabindranath Tagore University</w:t></w:r></w:p><w:p><w:pPr><w:pStyle w:val="ListBullet"/></w:pPr><w:r><w:rPr><w:sz w:val="19"/></w:rPr><w:t>Bachelor of Commerce with Computer Application — Kerala University</w:t></w:r></w:p><w:p><w:pPr><w:pStyle w:val="ListBullet"/></w:pPr><w:r><w:rPr><w:sz w:val="19"/></w:rPr><w:t>12th — CBSE</w:t></w:r></w:p><w:p><w:pPr><w:pStyle w:val="ListBullet"/></w:pPr><w:r><w:rPr><w:sz w:val="19"/></w:rPr><w:t>10th — CBSE</w:t></w:r></w:p><w:p/><w:p><w:r><w:rPr><w:b/><w:color w:val="1A375E"/><w:sz w:val="24"/></w:rPr><w:t>CERTIFICATIONS</w:t></w:r></w:p><w:p><w:pPr><w:pStyle w:val="ListBullet"/></w:pPr><w:r><w:rPr><w:sz w:val="19"/></w:rPr><w:t>Red Hat Certified System Administrator (RHCSA) — Cert ID: 170-179-113</w:t></w:r></w:p><w:p><w:pPr><w:pStyle w:val="ListBullet"/></w:pPr><w:r><w:rPr><w:sz w:val="19"/></w:rPr><w:t>Red Hat Certified Engineer (RHCE)</w:t></w:r></w:p><w:p><w:pPr><w:pStyle w:val="ListBullet"/></w:pPr><w:r><w:rPr><w:sz w:val="19"/></w:rPr><w:t>Certified Ethical Hacking</w:t></w:r></w:p><w:sectPr><w:pgSz w:w="12240" w:h="15840"/><w:pgMar w:top="864" w:right="864" w:bottom="864" w:left="864" w:header="720" w:footer="720" w:gutter="0"/><w:cols w:space="720"/><w:docGrid w:linePitch="360"/></w:sectPr></w:body></w:document>
 </file>
 
 <file path=word/numbering.xml><?xml version="1.0" encoding="utf-8"?>

</xml_diff>